<commit_message>
added basic rbac backend file as well as a few frontend files
</commit_message>
<xml_diff>
--- a/RBAC (1).docx
+++ b/RBAC (1).docx
@@ -1,6 +1,6 @@
 
 <file path=word/document.xml><?xml version="1.0" encoding="utf-8"?>
-<w:document xmlns:wpc="http://schemas.microsoft.com/office/word/2010/wordprocessingCanvas" xmlns:cx="http://schemas.microsoft.com/office/drawing/2014/chartex" xmlns:cx1="http://schemas.microsoft.com/office/drawing/2015/9/8/chartex" xmlns:cx2="http://schemas.microsoft.com/office/drawing/2015/10/21/chartex" xmlns:cx3="http://schemas.microsoft.com/office/drawing/2016/5/9/chartex" xmlns:cx4="http://schemas.microsoft.com/office/drawing/2016/5/10/chartex" xmlns:cx5="http://schemas.microsoft.com/office/drawing/2016/5/11/chartex" xmlns:cx6="http://schemas.microsoft.com/office/drawing/2016/5/12/chartex" xmlns:cx7="http://schemas.microsoft.com/office/drawing/2016/5/13/chartex" xmlns:cx8="http://schemas.microsoft.com/office/drawing/2016/5/14/chartex" xmlns:mc="http://schemas.openxmlformats.org/markup-compatibility/2006" xmlns:aink="http://schemas.microsoft.com/office/drawing/2016/ink" xmlns:am3d="http://schemas.microsoft.com/office/drawing/2017/model3d" xmlns:o="urn:schemas-microsoft-com:office:office" xmlns:oel="http://schemas.microsoft.com/office/2019/extlst" xmlns:r="http://schemas.openxmlformats.org/officeDocument/2006/relationships" xmlns:m="http://schemas.openxmlformats.org/officeDocument/2006/math" xmlns:v="urn:schemas-microsoft-com:vml" xmlns:wp14="http://schemas.microsoft.com/office/word/2010/wordprocessingDrawing" xmlns:wp="http://schemas.openxmlformats.org/drawingml/2006/wordprocessingDrawing" xmlns:w10="urn:schemas-microsoft-com:office:word" xmlns:w="http://schemas.openxmlformats.org/wordprocessingml/2006/main" xmlns:w14="http://schemas.microsoft.com/office/word/2010/wordml" xmlns:w15="http://schemas.microsoft.com/office/word/2012/wordml" xmlns:w16cex="http://schemas.microsoft.com/office/word/2018/wordml/cex" xmlns:w16cid="http://schemas.microsoft.com/office/word/2016/wordml/cid" xmlns:w16="http://schemas.microsoft.com/office/word/2018/wordml" xmlns:w16du="http://schemas.microsoft.com/office/word/2023/wordml/word16du" xmlns:w16sdtdh="http://schemas.microsoft.com/office/word/2020/wordml/sdtdatahash" xmlns:w16sdtfl="http://schemas.microsoft.com/office/word/2024/wordml/sdtformatlock" xmlns:w16se="http://schemas.microsoft.com/office/word/2015/wordml/symex" xmlns:wpg="http://schemas.microsoft.com/office/word/2010/wordprocessingGroup" xmlns:wpi="http://schemas.microsoft.com/office/word/2010/wordprocessingInk" xmlns:wne="http://schemas.microsoft.com/office/word/2006/wordml" xmlns:wps="http://schemas.microsoft.com/office/word/2010/wordprocessingShape" mc:Ignorable="w14 w15 w16se w16cid w16 w16cex w16sdtdh w16sdtfl w16du wp14">
+<w:document xmlns:ve="http://schemas.openxmlformats.org/markup-compatibility/2006" xmlns:o="urn:schemas-microsoft-com:office:office" xmlns:r="http://schemas.openxmlformats.org/officeDocument/2006/relationships" xmlns:m="http://schemas.openxmlformats.org/officeDocument/2006/math" xmlns:v="urn:schemas-microsoft-com:vml" xmlns:wp="http://schemas.openxmlformats.org/drawingml/2006/wordprocessingDrawing" xmlns:w10="urn:schemas-microsoft-com:office:word" xmlns:w="http://schemas.openxmlformats.org/wordprocessingml/2006/main" xmlns:wne="http://schemas.microsoft.com/office/word/2006/wordml">
   <w:body>
     <w:p>
       <w:pPr>
@@ -75,8 +75,8 @@
         <w:spacing w:after="0"/>
       </w:pPr>
       <w:r>
-        <w:pict w14:anchorId="2991BD61">
-          <v:rect id="_x0000_i1205" style="width:0;height:1.5pt" o:hralign="center" o:hrstd="t" o:hr="t" fillcolor="#a0a0a0" stroked="f"/>
+        <w:pict>
+          <v:rect id="_x0000_i1025" style="width:0;height:1.5pt" o:hralign="center" o:hrstd="t" o:hr="t" fillcolor="#a0a0a0" stroked="f"/>
         </w:pict>
       </w:r>
     </w:p>
@@ -222,8 +222,8 @@
         <w:spacing w:after="0"/>
       </w:pPr>
       <w:r>
-        <w:pict w14:anchorId="571AEACF">
-          <v:rect id="_x0000_i1206" style="width:0;height:1.5pt" o:hralign="center" o:hrstd="t" o:hr="t" fillcolor="#a0a0a0" stroked="f"/>
+        <w:pict>
+          <v:rect id="_x0000_i1026" style="width:0;height:1.5pt" o:hralign="center" o:hrstd="t" o:hr="t" fillcolor="#a0a0a0" stroked="f"/>
         </w:pict>
       </w:r>
     </w:p>
@@ -372,8 +372,8 @@
         <w:spacing w:after="0"/>
       </w:pPr>
       <w:r>
-        <w:pict w14:anchorId="3EAEE65C">
-          <v:rect id="_x0000_i1207" style="width:0;height:1.5pt" o:hralign="center" o:hrstd="t" o:hr="t" fillcolor="#a0a0a0" stroked="f"/>
+        <w:pict>
+          <v:rect id="_x0000_i1027" style="width:0;height:1.5pt" o:hralign="center" o:hrstd="t" o:hr="t" fillcolor="#a0a0a0" stroked="f"/>
         </w:pict>
       </w:r>
     </w:p>
@@ -568,8 +568,8 @@
         <w:spacing w:after="0"/>
       </w:pPr>
       <w:r>
-        <w:pict w14:anchorId="56C8251F">
-          <v:rect id="_x0000_i1208" style="width:0;height:1.5pt" o:hralign="center" o:hrstd="t" o:hr="t" fillcolor="#a0a0a0" stroked="f"/>
+        <w:pict>
+          <v:rect id="_x0000_i1028" style="width:0;height:1.5pt" o:hralign="center" o:hrstd="t" o:hr="t" fillcolor="#a0a0a0" stroked="f"/>
         </w:pict>
       </w:r>
     </w:p>
@@ -770,8 +770,8 @@
         <w:spacing w:after="0"/>
       </w:pPr>
       <w:r>
-        <w:pict w14:anchorId="5744FDF6">
-          <v:rect id="_x0000_i1209" style="width:0;height:1.5pt" o:hralign="center" o:hrstd="t" o:hr="t" fillcolor="#a0a0a0" stroked="f"/>
+        <w:pict>
+          <v:rect id="_x0000_i1029" style="width:0;height:1.5pt" o:hralign="center" o:hrstd="t" o:hr="t" fillcolor="#a0a0a0" stroked="f"/>
         </w:pict>
       </w:r>
     </w:p>
@@ -956,8 +956,8 @@
         <w:spacing w:after="0"/>
       </w:pPr>
       <w:r>
-        <w:pict w14:anchorId="0CCFAF32">
-          <v:rect id="_x0000_i1210" style="width:0;height:1.5pt" o:hralign="center" o:hrstd="t" o:hr="t" fillcolor="#a0a0a0" stroked="f"/>
+        <w:pict>
+          <v:rect id="_x0000_i1030" style="width:0;height:1.5pt" o:hralign="center" o:hrstd="t" o:hr="t" fillcolor="#a0a0a0" stroked="f"/>
         </w:pict>
       </w:r>
     </w:p>
@@ -1210,8 +1210,8 @@
         <w:spacing w:after="0"/>
       </w:pPr>
       <w:r>
-        <w:pict w14:anchorId="1680C910">
-          <v:rect id="_x0000_i1211" style="width:0;height:1.5pt" o:hralign="center" o:hrstd="t" o:hr="t" fillcolor="#a0a0a0" stroked="f"/>
+        <w:pict>
+          <v:rect id="_x0000_i1031" style="width:0;height:1.5pt" o:hralign="center" o:hrstd="t" o:hr="t" fillcolor="#a0a0a0" stroked="f"/>
         </w:pict>
       </w:r>
     </w:p>
@@ -1296,8 +1296,8 @@
         <w:spacing w:after="0"/>
       </w:pPr>
       <w:r>
-        <w:pict w14:anchorId="65AE319E">
-          <v:rect id="_x0000_i1212" style="width:0;height:1.5pt" o:hralign="center" o:hrstd="t" o:hr="t" fillcolor="#a0a0a0" stroked="f"/>
+        <w:pict>
+          <v:rect id="_x0000_i1032" style="width:0;height:1.5pt" o:hralign="center" o:hrstd="t" o:hr="t" fillcolor="#a0a0a0" stroked="f"/>
         </w:pict>
       </w:r>
     </w:p>
@@ -1314,41 +1314,41 @@
           <w:b/>
           <w:bCs/>
         </w:rPr>
+        <w:t>6. User Module (CRUD Enabled)</w:t>
+      </w:r>
+    </w:p>
+    <w:p>
+      <w:pPr>
+        <w:spacing w:after="0"/>
+        <w:rPr>
+          <w:b/>
+          <w:bCs/>
+        </w:rPr>
+      </w:pPr>
+      <w:r>
+        <w:rPr>
+          <w:b/>
+          <w:bCs/>
+        </w:rPr>
+        <w:t>6.1 Purpose</w:t>
+      </w:r>
+    </w:p>
+    <w:p>
+      <w:pPr>
+        <w:spacing w:after="0"/>
+      </w:pPr>
+      <w:r>
+        <w:t>Represents a human or system identity that can authenticate and perform actions.</w:t>
+      </w:r>
+    </w:p>
+    <w:p>
+      <w:pPr>
+        <w:spacing w:after="0"/>
+      </w:pPr>
+      <w:r>
         <w:lastRenderedPageBreak/>
-        <w:t>6. User Module (CRUD Enabled)</w:t>
-      </w:r>
-    </w:p>
-    <w:p>
-      <w:pPr>
-        <w:spacing w:after="0"/>
-        <w:rPr>
-          <w:b/>
-          <w:bCs/>
-        </w:rPr>
-      </w:pPr>
-      <w:r>
-        <w:rPr>
-          <w:b/>
-          <w:bCs/>
-        </w:rPr>
-        <w:t>6.1 Purpose</w:t>
-      </w:r>
-    </w:p>
-    <w:p>
-      <w:pPr>
-        <w:spacing w:after="0"/>
-      </w:pPr>
-      <w:r>
-        <w:t>Represents a human or system identity that can authenticate and perform actions.</w:t>
-      </w:r>
-    </w:p>
-    <w:p>
-      <w:pPr>
-        <w:spacing w:after="0"/>
-      </w:pPr>
-      <w:r>
-        <w:pict w14:anchorId="66B26D30">
-          <v:rect id="_x0000_i1213" style="width:0;height:1.5pt" o:hralign="center" o:hrstd="t" o:hr="t" fillcolor="#a0a0a0" stroked="f"/>
+        <w:pict>
+          <v:rect id="_x0000_i1033" style="width:0;height:1.5pt" o:hralign="center" o:hrstd="t" o:hr="t" fillcolor="#a0a0a0" stroked="f"/>
         </w:pict>
       </w:r>
     </w:p>
@@ -1895,41 +1895,111 @@
         <w:spacing w:after="0"/>
       </w:pPr>
       <w:r>
+        <w:t>Aggregation Format</w:t>
+      </w:r>
+    </w:p>
+    <w:p>
+      <w:pPr>
+        <w:spacing w:after="0"/>
+      </w:pPr>
+      <w:r>
+        <w:rPr>
+          <w:b/>
+          <w:bCs/>
+        </w:rPr>
+        <w:t>Communication</w:t>
+      </w:r>
+    </w:p>
+    <w:p>
+      <w:pPr>
+        <w:numPr>
+          <w:ilvl w:val="0"/>
+          <w:numId w:val="19"/>
+        </w:numPr>
+        <w:spacing w:after="0"/>
+      </w:pPr>
+      <w:r>
+        <w:t xml:space="preserve">Signature </w:t>
+      </w:r>
+    </w:p>
+    <w:p>
+      <w:pPr>
+        <w:spacing w:after="0"/>
+      </w:pPr>
+      <w:r>
+        <w:pict>
+          <v:rect id="_x0000_i1034" style="width:0;height:1.5pt" o:hralign="center" o:hrstd="t" o:hr="t" fillcolor="#a0a0a0" stroked="f"/>
+        </w:pict>
+      </w:r>
+    </w:p>
+    <w:p>
+      <w:pPr>
+        <w:spacing w:after="0"/>
+        <w:rPr>
+          <w:b/>
+          <w:bCs/>
+        </w:rPr>
+      </w:pPr>
+      <w:r>
+        <w:rPr>
+          <w:b/>
+          <w:bCs/>
+        </w:rPr>
+        <w:t>6.3 Behaviour</w:t>
+      </w:r>
+    </w:p>
+    <w:p>
+      <w:pPr>
+        <w:numPr>
+          <w:ilvl w:val="0"/>
+          <w:numId w:val="20"/>
+        </w:numPr>
+        <w:spacing w:after="0"/>
+      </w:pPr>
+      <w:r>
+        <w:t>Role change triggers access recalculation</w:t>
+      </w:r>
+    </w:p>
+    <w:p>
+      <w:pPr>
+        <w:numPr>
+          <w:ilvl w:val="0"/>
+          <w:numId w:val="20"/>
+        </w:numPr>
+        <w:spacing w:after="0"/>
+      </w:pPr>
+      <w:r>
         <w:lastRenderedPageBreak/>
-        <w:t>Aggregation Format</w:t>
-      </w:r>
-    </w:p>
-    <w:p>
-      <w:pPr>
-        <w:spacing w:after="0"/>
-      </w:pPr>
-      <w:r>
-        <w:rPr>
-          <w:b/>
-          <w:bCs/>
-        </w:rPr>
-        <w:t>Communication</w:t>
-      </w:r>
-    </w:p>
-    <w:p>
-      <w:pPr>
-        <w:numPr>
-          <w:ilvl w:val="0"/>
-          <w:numId w:val="19"/>
-        </w:numPr>
-        <w:spacing w:after="0"/>
-      </w:pPr>
-      <w:r>
-        <w:t>Signature (HTML allowed)</w:t>
-      </w:r>
-    </w:p>
-    <w:p>
-      <w:pPr>
-        <w:spacing w:after="0"/>
-      </w:pPr>
-      <w:r>
-        <w:pict w14:anchorId="6613AEC4">
-          <v:rect id="_x0000_i1214" style="width:0;height:1.5pt" o:hralign="center" o:hrstd="t" o:hr="t" fillcolor="#a0a0a0" stroked="f"/>
+        <w:t>Status change immediately enables or disables access</w:t>
+      </w:r>
+    </w:p>
+    <w:p>
+      <w:pPr>
+        <w:numPr>
+          <w:ilvl w:val="0"/>
+          <w:numId w:val="20"/>
+        </w:numPr>
+        <w:spacing w:after="0"/>
+      </w:pPr>
+      <w:r>
+        <w:t>Delete defaults to soft delete</w:t>
+      </w:r>
+    </w:p>
+    <w:p>
+      <w:pPr>
+        <w:spacing w:after="0"/>
+      </w:pPr>
+      <w:r>
+        <w:t>All changes are audited.</w:t>
+      </w:r>
+    </w:p>
+    <w:p>
+      <w:pPr>
+        <w:spacing w:after="0"/>
+      </w:pPr>
+      <w:r>
+        <w:pict>
+          <v:rect id="_x0000_i1035" style="width:0;height:1.5pt" o:hralign="center" o:hrstd="t" o:hr="t" fillcolor="#a0a0a0" stroked="f"/>
         </w:pict>
       </w:r>
     </w:p>
@@ -1946,60 +2016,50 @@
           <w:b/>
           <w:bCs/>
         </w:rPr>
-        <w:t>6.3 Behaviour</w:t>
-      </w:r>
-    </w:p>
-    <w:p>
-      <w:pPr>
-        <w:numPr>
-          <w:ilvl w:val="0"/>
-          <w:numId w:val="20"/>
-        </w:numPr>
-        <w:spacing w:after="0"/>
-      </w:pPr>
-      <w:r>
-        <w:t>Role change triggers access recalculation</w:t>
-      </w:r>
-    </w:p>
-    <w:p>
-      <w:pPr>
-        <w:numPr>
-          <w:ilvl w:val="0"/>
-          <w:numId w:val="20"/>
-        </w:numPr>
-        <w:spacing w:after="0"/>
-      </w:pPr>
-      <w:r>
-        <w:t>Status change immediately enables or disables access</w:t>
-      </w:r>
-    </w:p>
-    <w:p>
-      <w:pPr>
-        <w:numPr>
-          <w:ilvl w:val="0"/>
-          <w:numId w:val="20"/>
-        </w:numPr>
-        <w:spacing w:after="0"/>
-      </w:pPr>
-      <w:r>
-        <w:t>Delete defaults to soft delete</w:t>
-      </w:r>
-    </w:p>
-    <w:p>
-      <w:pPr>
-        <w:spacing w:after="0"/>
-      </w:pPr>
-      <w:r>
-        <w:t>All changes are audited.</w:t>
-      </w:r>
-    </w:p>
-    <w:p>
-      <w:pPr>
-        <w:spacing w:after="0"/>
-      </w:pPr>
-      <w:r>
-        <w:pict w14:anchorId="1C24775D">
-          <v:rect id="_x0000_i1215" style="width:0;height:1.5pt" o:hralign="center" o:hrstd="t" o:hr="t" fillcolor="#a0a0a0" stroked="f"/>
+        <w:t>7. Role Module (Hierarchy)</w:t>
+      </w:r>
+    </w:p>
+    <w:p>
+      <w:pPr>
+        <w:spacing w:after="0"/>
+        <w:rPr>
+          <w:b/>
+          <w:bCs/>
+        </w:rPr>
+      </w:pPr>
+      <w:r>
+        <w:rPr>
+          <w:b/>
+          <w:bCs/>
+        </w:rPr>
+        <w:t>7.1 Purpose</w:t>
+      </w:r>
+    </w:p>
+    <w:p>
+      <w:pPr>
+        <w:spacing w:after="0"/>
+      </w:pPr>
+      <w:r>
+        <w:t xml:space="preserve">Defines </w:t>
+      </w:r>
+      <w:r>
+        <w:rPr>
+          <w:b/>
+          <w:bCs/>
+        </w:rPr>
+        <w:t>authority and hierarchy</w:t>
+      </w:r>
+      <w:r>
+        <w:t>, not permissions.</w:t>
+      </w:r>
+    </w:p>
+    <w:p>
+      <w:pPr>
+        <w:spacing w:after="0"/>
+      </w:pPr>
+      <w:r>
+        <w:pict>
+          <v:rect id="_x0000_i1036" style="width:0;height:1.5pt" o:hralign="center" o:hrstd="t" o:hr="t" fillcolor="#a0a0a0" stroked="f"/>
         </w:pict>
       </w:r>
     </w:p>
@@ -2016,23 +2076,147 @@
           <w:b/>
           <w:bCs/>
         </w:rPr>
-        <w:t>7. Role Module (Hierarchy)</w:t>
-      </w:r>
-    </w:p>
-    <w:p>
-      <w:pPr>
-        <w:spacing w:after="0"/>
-        <w:rPr>
-          <w:b/>
-          <w:bCs/>
-        </w:rPr>
-      </w:pPr>
-      <w:r>
-        <w:rPr>
-          <w:b/>
-          <w:bCs/>
-        </w:rPr>
-        <w:t>7.1 Purpose</w:t>
+        <w:t>7.2 Rules</w:t>
+      </w:r>
+    </w:p>
+    <w:p>
+      <w:pPr>
+        <w:numPr>
+          <w:ilvl w:val="0"/>
+          <w:numId w:val="21"/>
+        </w:numPr>
+        <w:spacing w:after="0"/>
+      </w:pPr>
+      <w:r>
+        <w:t>Roles form a strict tree</w:t>
+      </w:r>
+    </w:p>
+    <w:p>
+      <w:pPr>
+        <w:numPr>
+          <w:ilvl w:val="0"/>
+          <w:numId w:val="21"/>
+        </w:numPr>
+        <w:spacing w:after="0"/>
+      </w:pPr>
+      <w:r>
+        <w:t>Single parent per role</w:t>
+      </w:r>
+    </w:p>
+    <w:p>
+      <w:pPr>
+        <w:numPr>
+          <w:ilvl w:val="0"/>
+          <w:numId w:val="21"/>
+        </w:numPr>
+        <w:spacing w:after="0"/>
+      </w:pPr>
+      <w:r>
+        <w:t>No circular references</w:t>
+      </w:r>
+    </w:p>
+    <w:p>
+      <w:pPr>
+        <w:spacing w:after="0"/>
+      </w:pPr>
+      <w:r>
+        <w:pict>
+          <v:rect id="_x0000_i1037" style="width:0;height:1.5pt" o:hralign="center" o:hrstd="t" o:hr="t" fillcolor="#a0a0a0" stroked="f"/>
+        </w:pict>
+      </w:r>
+    </w:p>
+    <w:p>
+      <w:pPr>
+        <w:spacing w:after="0"/>
+        <w:rPr>
+          <w:b/>
+          <w:bCs/>
+        </w:rPr>
+      </w:pPr>
+      <w:r>
+        <w:rPr>
+          <w:b/>
+          <w:bCs/>
+        </w:rPr>
+        <w:t>7.3 CRUD Behaviour</w:t>
+      </w:r>
+    </w:p>
+    <w:p>
+      <w:pPr>
+        <w:numPr>
+          <w:ilvl w:val="0"/>
+          <w:numId w:val="22"/>
+        </w:numPr>
+        <w:spacing w:after="0"/>
+      </w:pPr>
+      <w:r>
+        <w:t>Create role with parent</w:t>
+      </w:r>
+    </w:p>
+    <w:p>
+      <w:pPr>
+        <w:numPr>
+          <w:ilvl w:val="0"/>
+          <w:numId w:val="22"/>
+        </w:numPr>
+        <w:spacing w:after="0"/>
+      </w:pPr>
+      <w:r>
+        <w:t>Update role hierarchy with validation</w:t>
+      </w:r>
+    </w:p>
+    <w:p>
+      <w:pPr>
+        <w:numPr>
+          <w:ilvl w:val="0"/>
+          <w:numId w:val="22"/>
+        </w:numPr>
+        <w:spacing w:after="0"/>
+      </w:pPr>
+      <w:r>
+        <w:t>Delete blocked if users assigned</w:t>
+      </w:r>
+    </w:p>
+    <w:p>
+      <w:pPr>
+        <w:spacing w:after="0"/>
+      </w:pPr>
+      <w:r>
+        <w:pict>
+          <v:rect id="_x0000_i1038" style="width:0;height:1.5pt" o:hralign="center" o:hrstd="t" o:hr="t" fillcolor="#a0a0a0" stroked="f"/>
+        </w:pict>
+      </w:r>
+    </w:p>
+    <w:p>
+      <w:pPr>
+        <w:spacing w:after="0"/>
+        <w:rPr>
+          <w:b/>
+          <w:bCs/>
+        </w:rPr>
+      </w:pPr>
+      <w:r>
+        <w:rPr>
+          <w:b/>
+          <w:bCs/>
+        </w:rPr>
+        <w:t>8. Permission / Profile Module</w:t>
+      </w:r>
+    </w:p>
+    <w:p>
+      <w:pPr>
+        <w:spacing w:after="0"/>
+        <w:rPr>
+          <w:b/>
+          <w:bCs/>
+        </w:rPr>
+      </w:pPr>
+      <w:r>
+        <w:rPr>
+          <w:b/>
+          <w:bCs/>
+        </w:rPr>
+        <w:t>8.1 Purpose</w:t>
       </w:r>
     </w:p>
     <w:p>
@@ -2047,19 +2231,19 @@
           <w:b/>
           <w:bCs/>
         </w:rPr>
-        <w:t>authority and hierarchy</w:t>
-      </w:r>
-      <w:r>
-        <w:t>, not permissions.</w:t>
-      </w:r>
-    </w:p>
-    <w:p>
-      <w:pPr>
-        <w:spacing w:after="0"/>
-      </w:pPr>
-      <w:r>
-        <w:pict w14:anchorId="3E03DC50">
-          <v:rect id="_x0000_i1216" style="width:0;height:1.5pt" o:hralign="center" o:hrstd="t" o:hr="t" fillcolor="#a0a0a0" stroked="f"/>
+        <w:t>what actions are allowed</w:t>
+      </w:r>
+      <w:r>
+        <w:t>.</w:t>
+      </w:r>
+    </w:p>
+    <w:p>
+      <w:pPr>
+        <w:spacing w:after="0"/>
+      </w:pPr>
+      <w:r>
+        <w:pict>
+          <v:rect id="_x0000_i1039" style="width:0;height:1.5pt" o:hralign="center" o:hrstd="t" o:hr="t" fillcolor="#a0a0a0" stroked="f"/>
         </w:pict>
       </w:r>
     </w:p>
@@ -2076,52 +2260,68 @@
           <w:b/>
           <w:bCs/>
         </w:rPr>
-        <w:t>7.2 Rules</w:t>
-      </w:r>
-    </w:p>
-    <w:p>
-      <w:pPr>
-        <w:numPr>
-          <w:ilvl w:val="0"/>
-          <w:numId w:val="21"/>
-        </w:numPr>
-        <w:spacing w:after="0"/>
-      </w:pPr>
-      <w:r>
-        <w:t>Roles form a strict tree</w:t>
-      </w:r>
-    </w:p>
-    <w:p>
-      <w:pPr>
-        <w:numPr>
-          <w:ilvl w:val="0"/>
-          <w:numId w:val="21"/>
-        </w:numPr>
-        <w:spacing w:after="0"/>
-      </w:pPr>
-      <w:r>
-        <w:t>Single parent per role</w:t>
-      </w:r>
-    </w:p>
-    <w:p>
-      <w:pPr>
-        <w:numPr>
-          <w:ilvl w:val="0"/>
-          <w:numId w:val="21"/>
-        </w:numPr>
-        <w:spacing w:after="0"/>
-      </w:pPr>
-      <w:r>
-        <w:t>No circular references</w:t>
-      </w:r>
-    </w:p>
-    <w:p>
-      <w:pPr>
-        <w:spacing w:after="0"/>
-      </w:pPr>
-      <w:r>
-        <w:pict w14:anchorId="3527C560">
-          <v:rect id="_x0000_i1217" style="width:0;height:1.5pt" o:hralign="center" o:hrstd="t" o:hr="t" fillcolor="#a0a0a0" stroked="f"/>
+        <w:t>8.2 Permission Model</w:t>
+      </w:r>
+    </w:p>
+    <w:p>
+      <w:pPr>
+        <w:spacing w:after="0"/>
+      </w:pPr>
+      <w:r>
+        <w:t>Permissions are defined as:</w:t>
+      </w:r>
+    </w:p>
+    <w:p>
+      <w:pPr>
+        <w:numPr>
+          <w:ilvl w:val="0"/>
+          <w:numId w:val="23"/>
+        </w:numPr>
+        <w:spacing w:after="0"/>
+      </w:pPr>
+      <w:r>
+        <w:t>Application</w:t>
+      </w:r>
+    </w:p>
+    <w:p>
+      <w:pPr>
+        <w:numPr>
+          <w:ilvl w:val="0"/>
+          <w:numId w:val="23"/>
+        </w:numPr>
+        <w:spacing w:after="0"/>
+      </w:pPr>
+      <w:r>
+        <w:t>Module</w:t>
+      </w:r>
+    </w:p>
+    <w:p>
+      <w:pPr>
+        <w:numPr>
+          <w:ilvl w:val="0"/>
+          <w:numId w:val="23"/>
+        </w:numPr>
+        <w:spacing w:after="0"/>
+      </w:pPr>
+      <w:r>
+        <w:t>Action (Create, Read, Update, Delete)</w:t>
+      </w:r>
+    </w:p>
+    <w:p>
+      <w:pPr>
+        <w:spacing w:after="0"/>
+      </w:pPr>
+      <w:r>
+        <w:t>Permissions are grouped into Profiles.</w:t>
+      </w:r>
+    </w:p>
+    <w:p>
+      <w:pPr>
+        <w:spacing w:after="0"/>
+      </w:pPr>
+      <w:r>
+        <w:pict>
+          <v:rect id="_x0000_i1040" style="width:0;height:1.5pt" o:hralign="center" o:hrstd="t" o:hr="t" fillcolor="#a0a0a0" stroked="f"/>
         </w:pict>
       </w:r>
     </w:p>
@@ -2138,222 +2338,6 @@
           <w:b/>
           <w:bCs/>
         </w:rPr>
-        <w:t>7.3 CRUD Behaviour</w:t>
-      </w:r>
-    </w:p>
-    <w:p>
-      <w:pPr>
-        <w:numPr>
-          <w:ilvl w:val="0"/>
-          <w:numId w:val="22"/>
-        </w:numPr>
-        <w:spacing w:after="0"/>
-      </w:pPr>
-      <w:r>
-        <w:t>Create role with parent</w:t>
-      </w:r>
-    </w:p>
-    <w:p>
-      <w:pPr>
-        <w:numPr>
-          <w:ilvl w:val="0"/>
-          <w:numId w:val="22"/>
-        </w:numPr>
-        <w:spacing w:after="0"/>
-      </w:pPr>
-      <w:r>
-        <w:t>Update role hierarchy with validation</w:t>
-      </w:r>
-    </w:p>
-    <w:p>
-      <w:pPr>
-        <w:numPr>
-          <w:ilvl w:val="0"/>
-          <w:numId w:val="22"/>
-        </w:numPr>
-        <w:spacing w:after="0"/>
-      </w:pPr>
-      <w:r>
-        <w:t>Delete blocked if users assigned</w:t>
-      </w:r>
-    </w:p>
-    <w:p>
-      <w:pPr>
-        <w:spacing w:after="0"/>
-      </w:pPr>
-      <w:r>
-        <w:pict w14:anchorId="51CBC552">
-          <v:rect id="_x0000_i1218" style="width:0;height:1.5pt" o:hralign="center" o:hrstd="t" o:hr="t" fillcolor="#a0a0a0" stroked="f"/>
-        </w:pict>
-      </w:r>
-    </w:p>
-    <w:p>
-      <w:pPr>
-        <w:spacing w:after="0"/>
-        <w:rPr>
-          <w:b/>
-          <w:bCs/>
-        </w:rPr>
-      </w:pPr>
-      <w:r>
-        <w:rPr>
-          <w:b/>
-          <w:bCs/>
-        </w:rPr>
-        <w:t>8. Permission / Profile Module</w:t>
-      </w:r>
-    </w:p>
-    <w:p>
-      <w:pPr>
-        <w:spacing w:after="0"/>
-        <w:rPr>
-          <w:b/>
-          <w:bCs/>
-        </w:rPr>
-      </w:pPr>
-      <w:r>
-        <w:rPr>
-          <w:b/>
-          <w:bCs/>
-        </w:rPr>
-        <w:t>8.1 Purpose</w:t>
-      </w:r>
-    </w:p>
-    <w:p>
-      <w:pPr>
-        <w:spacing w:after="0"/>
-      </w:pPr>
-      <w:r>
-        <w:t xml:space="preserve">Defines </w:t>
-      </w:r>
-      <w:r>
-        <w:rPr>
-          <w:b/>
-          <w:bCs/>
-        </w:rPr>
-        <w:t>what actions are allowed</w:t>
-      </w:r>
-      <w:r>
-        <w:t>.</w:t>
-      </w:r>
-    </w:p>
-    <w:p>
-      <w:pPr>
-        <w:spacing w:after="0"/>
-      </w:pPr>
-      <w:r>
-        <w:pict w14:anchorId="115DC5A4">
-          <v:rect id="_x0000_i1219" style="width:0;height:1.5pt" o:hralign="center" o:hrstd="t" o:hr="t" fillcolor="#a0a0a0" stroked="f"/>
-        </w:pict>
-      </w:r>
-    </w:p>
-    <w:p>
-      <w:pPr>
-        <w:spacing w:after="0"/>
-        <w:rPr>
-          <w:b/>
-          <w:bCs/>
-        </w:rPr>
-      </w:pPr>
-      <w:r>
-        <w:rPr>
-          <w:b/>
-          <w:bCs/>
-        </w:rPr>
-        <w:t>8.2 Permission Model</w:t>
-      </w:r>
-    </w:p>
-    <w:p>
-      <w:pPr>
-        <w:spacing w:after="0"/>
-      </w:pPr>
-      <w:r>
-        <w:t>Permissions are defined as:</w:t>
-      </w:r>
-    </w:p>
-    <w:p>
-      <w:pPr>
-        <w:numPr>
-          <w:ilvl w:val="0"/>
-          <w:numId w:val="23"/>
-        </w:numPr>
-        <w:spacing w:after="0"/>
-      </w:pPr>
-      <w:r>
-        <w:t>Application</w:t>
-      </w:r>
-    </w:p>
-    <w:p>
-      <w:pPr>
-        <w:numPr>
-          <w:ilvl w:val="0"/>
-          <w:numId w:val="23"/>
-        </w:numPr>
-        <w:spacing w:after="0"/>
-      </w:pPr>
-      <w:r>
-        <w:t>Module</w:t>
-      </w:r>
-    </w:p>
-    <w:p>
-      <w:pPr>
-        <w:numPr>
-          <w:ilvl w:val="0"/>
-          <w:numId w:val="23"/>
-        </w:numPr>
-        <w:spacing w:after="0"/>
-      </w:pPr>
-      <w:r>
-        <w:t>Action (Create, Read, Update, Delete)</w:t>
-      </w:r>
-    </w:p>
-    <w:p>
-      <w:pPr>
-        <w:numPr>
-          <w:ilvl w:val="0"/>
-          <w:numId w:val="23"/>
-        </w:numPr>
-        <w:spacing w:after="0"/>
-      </w:pPr>
-      <w:r>
-        <w:t>Field</w:t>
-      </w:r>
-      <w:r>
-        <w:noBreakHyphen/>
-        <w:t>level overrides (Hide / Read / Write)</w:t>
-      </w:r>
-    </w:p>
-    <w:p>
-      <w:pPr>
-        <w:spacing w:after="0"/>
-      </w:pPr>
-      <w:r>
-        <w:t>Permissions are grouped into Profiles.</w:t>
-      </w:r>
-    </w:p>
-    <w:p>
-      <w:pPr>
-        <w:spacing w:after="0"/>
-      </w:pPr>
-      <w:r>
-        <w:pict w14:anchorId="5573D8CD">
-          <v:rect id="_x0000_i1220" style="width:0;height:1.5pt" o:hralign="center" o:hrstd="t" o:hr="t" fillcolor="#a0a0a0" stroked="f"/>
-        </w:pict>
-      </w:r>
-    </w:p>
-    <w:p>
-      <w:pPr>
-        <w:spacing w:after="0"/>
-        <w:rPr>
-          <w:b/>
-          <w:bCs/>
-        </w:rPr>
-      </w:pPr>
-      <w:r>
-        <w:rPr>
-          <w:b/>
-          <w:bCs/>
-        </w:rPr>
         <w:t>8.3 Assignment</w:t>
       </w:r>
     </w:p>
@@ -2386,8 +2370,8 @@
         <w:spacing w:after="0"/>
       </w:pPr>
       <w:r>
-        <w:pict w14:anchorId="58512177">
-          <v:rect id="_x0000_i1221" style="width:0;height:1.5pt" o:hralign="center" o:hrstd="t" o:hr="t" fillcolor="#a0a0a0" stroked="f"/>
+        <w:pict>
+          <v:rect id="_x0000_i1041" style="width:0;height:1.5pt" o:hralign="center" o:hrstd="t" o:hr="t" fillcolor="#a0a0a0" stroked="f"/>
         </w:pict>
       </w:r>
     </w:p>
@@ -2440,8 +2424,8 @@
         <w:spacing w:after="0"/>
       </w:pPr>
       <w:r>
-        <w:pict w14:anchorId="3B7DA8C6">
-          <v:rect id="_x0000_i1222" style="width:0;height:1.5pt" o:hralign="center" o:hrstd="t" o:hr="t" fillcolor="#a0a0a0" stroked="f"/>
+        <w:pict>
+          <v:rect id="_x0000_i1042" style="width:0;height:1.5pt" o:hralign="center" o:hrstd="t" o:hr="t" fillcolor="#a0a0a0" stroked="f"/>
         </w:pict>
       </w:r>
     </w:p>
@@ -2502,9 +2486,8 @@
         <w:spacing w:after="0"/>
       </w:pPr>
       <w:r>
-        <w:lastRenderedPageBreak/>
-        <w:pict w14:anchorId="5EC085E6">
-          <v:rect id="_x0000_i1223" style="width:0;height:1.5pt" o:hralign="center" o:hrstd="t" o:hr="t" fillcolor="#a0a0a0" stroked="f"/>
+        <w:pict>
+          <v:rect id="_x0000_i1043" style="width:0;height:1.5pt" o:hralign="center" o:hrstd="t" o:hr="t" fillcolor="#a0a0a0" stroked="f"/>
         </w:pict>
       </w:r>
     </w:p>
@@ -2553,8 +2536,8 @@
         <w:spacing w:after="0"/>
       </w:pPr>
       <w:r>
-        <w:pict w14:anchorId="1ADDBDD2">
-          <v:rect id="_x0000_i1224" style="width:0;height:1.5pt" o:hralign="center" o:hrstd="t" o:hr="t" fillcolor="#a0a0a0" stroked="f"/>
+        <w:pict>
+          <v:rect id="_x0000_i1044" style="width:0;height:1.5pt" o:hralign="center" o:hrstd="t" o:hr="t" fillcolor="#a0a0a0" stroked="f"/>
         </w:pict>
       </w:r>
     </w:p>
@@ -2655,6 +2638,7 @@
         <w:spacing w:after="0"/>
       </w:pPr>
       <w:r>
+        <w:lastRenderedPageBreak/>
         <w:t>Sharing grants visibility only, never capability.</w:t>
       </w:r>
     </w:p>
@@ -2663,8 +2647,8 @@
         <w:spacing w:after="0"/>
       </w:pPr>
       <w:r>
-        <w:pict w14:anchorId="47C7DF08">
-          <v:rect id="_x0000_i1225" style="width:0;height:1.5pt" o:hralign="center" o:hrstd="t" o:hr="t" fillcolor="#a0a0a0" stroked="f"/>
+        <w:pict>
+          <v:rect id="_x0000_i1045" style="width:0;height:1.5pt" o:hralign="center" o:hrstd="t" o:hr="t" fillcolor="#a0a0a0" stroked="f"/>
         </w:pict>
       </w:r>
     </w:p>
@@ -2789,8 +2773,8 @@
         <w:spacing w:after="0"/>
       </w:pPr>
       <w:r>
-        <w:pict w14:anchorId="59C40328">
-          <v:rect id="_x0000_i1226" style="width:0;height:1.5pt" o:hralign="center" o:hrstd="t" o:hr="t" fillcolor="#a0a0a0" stroked="f"/>
+        <w:pict>
+          <v:rect id="_x0000_i1046" style="width:0;height:1.5pt" o:hralign="center" o:hrstd="t" o:hr="t" fillcolor="#a0a0a0" stroked="f"/>
         </w:pict>
       </w:r>
     </w:p>
@@ -2867,16 +2851,16 @@
         <w:spacing w:after="0"/>
       </w:pPr>
       <w:r>
-        <w:t>Permission denials (optional)</w:t>
-      </w:r>
-    </w:p>
-    <w:p>
-      <w:pPr>
-        <w:spacing w:after="0"/>
-      </w:pPr>
-      <w:r>
-        <w:pict w14:anchorId="4FB9F9C9">
-          <v:rect id="_x0000_i1227" style="width:0;height:1.5pt" o:hralign="center" o:hrstd="t" o:hr="t" fillcolor="#a0a0a0" stroked="f"/>
+        <w:t xml:space="preserve">Permission denials </w:t>
+      </w:r>
+    </w:p>
+    <w:p>
+      <w:pPr>
+        <w:spacing w:after="0"/>
+      </w:pPr>
+      <w:r>
+        <w:pict>
+          <v:rect id="_x0000_i1047" style="width:0;height:1.5pt" o:hralign="center" o:hrstd="t" o:hr="t" fillcolor="#a0a0a0" stroked="f"/>
         </w:pict>
       </w:r>
     </w:p>
@@ -3033,13 +3017,8 @@
         <w:spacing w:after="0"/>
       </w:pPr>
       <w:r>
-        <w:t xml:space="preserve">Audit data is </w:t>
-      </w:r>
-      <w:proofErr w:type="gramStart"/>
-      <w:r>
-        <w:t>append</w:t>
-      </w:r>
-      <w:proofErr w:type="gramEnd"/>
+        <w:t>Audit data is append</w:t>
+      </w:r>
       <w:r>
         <w:noBreakHyphen/>
         <w:t>only.</w:t>
@@ -3050,8 +3029,8 @@
         <w:spacing w:after="0"/>
       </w:pPr>
       <w:r>
-        <w:pict w14:anchorId="2CB06F35">
-          <v:rect id="_x0000_i1228" style="width:0;height:1.5pt" o:hralign="center" o:hrstd="t" o:hr="t" fillcolor="#a0a0a0" stroked="f"/>
+        <w:pict>
+          <v:rect id="_x0000_i1048" style="width:0;height:1.5pt" o:hralign="center" o:hrstd="t" o:hr="t" fillcolor="#a0a0a0" stroked="f"/>
         </w:pict>
       </w:r>
     </w:p>
@@ -3100,8 +3079,8 @@
         <w:spacing w:after="0"/>
       </w:pPr>
       <w:r>
-        <w:pict w14:anchorId="07A72045">
-          <v:rect id="_x0000_i1229" style="width:0;height:1.5pt" o:hralign="center" o:hrstd="t" o:hr="t" fillcolor="#a0a0a0" stroked="f"/>
+        <w:pict>
+          <v:rect id="_x0000_i1049" style="width:0;height:1.5pt" o:hralign="center" o:hrstd="t" o:hr="t" fillcolor="#a0a0a0" stroked="f"/>
         </w:pict>
       </w:r>
     </w:p>
@@ -3118,7 +3097,6 @@
           <w:b/>
           <w:bCs/>
         </w:rPr>
-        <w:lastRenderedPageBreak/>
         <w:t>13.2 Fields</w:t>
       </w:r>
     </w:p>
@@ -3239,8 +3217,8 @@
         <w:spacing w:after="0"/>
       </w:pPr>
       <w:r>
-        <w:pict w14:anchorId="318DACA4">
-          <v:rect id="_x0000_i1230" style="width:0;height:1.5pt" o:hralign="center" o:hrstd="t" o:hr="t" fillcolor="#a0a0a0" stroked="f"/>
+        <w:pict>
+          <v:rect id="_x0000_i1050" style="width:0;height:1.5pt" o:hralign="center" o:hrstd="t" o:hr="t" fillcolor="#a0a0a0" stroked="f"/>
         </w:pict>
       </w:r>
     </w:p>
@@ -3281,6 +3259,7 @@
         <w:spacing w:after="0"/>
       </w:pPr>
       <w:r>
+        <w:lastRenderedPageBreak/>
         <w:t>All changes audited</w:t>
       </w:r>
     </w:p>
@@ -3289,8 +3268,8 @@
         <w:spacing w:after="0"/>
       </w:pPr>
       <w:r>
-        <w:pict w14:anchorId="2324E48D">
-          <v:rect id="_x0000_i1231" style="width:0;height:1.5pt" o:hralign="center" o:hrstd="t" o:hr="t" fillcolor="#a0a0a0" stroked="f"/>
+        <w:pict>
+          <v:rect id="_x0000_i1051" style="width:0;height:1.5pt" o:hralign="center" o:hrstd="t" o:hr="t" fillcolor="#a0a0a0" stroked="f"/>
         </w:pict>
       </w:r>
     </w:p>
@@ -3359,8 +3338,8 @@
         <w:spacing w:after="0"/>
       </w:pPr>
       <w:r>
-        <w:pict w14:anchorId="5960A7F3">
-          <v:rect id="_x0000_i1232" style="width:0;height:1.5pt" o:hralign="center" o:hrstd="t" o:hr="t" fillcolor="#a0a0a0" stroked="f"/>
+        <w:pict>
+          <v:rect id="_x0000_i1052" style="width:0;height:1.5pt" o:hralign="center" o:hrstd="t" o:hr="t" fillcolor="#a0a0a0" stroked="f"/>
         </w:pict>
       </w:r>
     </w:p>
@@ -3449,8 +3428,8 @@
         <w:spacing w:after="0"/>
       </w:pPr>
       <w:r>
-        <w:pict w14:anchorId="6C17EDFD">
-          <v:rect id="_x0000_i1233" style="width:0;height:1.5pt" o:hralign="center" o:hrstd="t" o:hr="t" fillcolor="#a0a0a0" stroked="f"/>
+        <w:pict>
+          <v:rect id="_x0000_i1053" style="width:0;height:1.5pt" o:hralign="center" o:hrstd="t" o:hr="t" fillcolor="#a0a0a0" stroked="f"/>
         </w:pict>
       </w:r>
     </w:p>
@@ -3527,8 +3506,8 @@
         <w:spacing w:after="0"/>
       </w:pPr>
       <w:r>
-        <w:pict w14:anchorId="6D120582">
-          <v:rect id="_x0000_i1234" style="width:0;height:1.5pt" o:hralign="center" o:hrstd="t" o:hr="t" fillcolor="#a0a0a0" stroked="f"/>
+        <w:pict>
+          <v:rect id="_x0000_i1054" style="width:0;height:1.5pt" o:hralign="center" o:hrstd="t" o:hr="t" fillcolor="#a0a0a0" stroked="f"/>
         </w:pict>
       </w:r>
     </w:p>
@@ -3649,8 +3628,8 @@
 </file>
 
 <file path=word/numbering.xml><?xml version="1.0" encoding="utf-8"?>
-<w:numbering xmlns:wpc="http://schemas.microsoft.com/office/word/2010/wordprocessingCanvas" xmlns:cx="http://schemas.microsoft.com/office/drawing/2014/chartex" xmlns:cx1="http://schemas.microsoft.com/office/drawing/2015/9/8/chartex" xmlns:cx2="http://schemas.microsoft.com/office/drawing/2015/10/21/chartex" xmlns:cx3="http://schemas.microsoft.com/office/drawing/2016/5/9/chartex" xmlns:cx4="http://schemas.microsoft.com/office/drawing/2016/5/10/chartex" xmlns:cx5="http://schemas.microsoft.com/office/drawing/2016/5/11/chartex" xmlns:cx6="http://schemas.microsoft.com/office/drawing/2016/5/12/chartex" xmlns:cx7="http://schemas.microsoft.com/office/drawing/2016/5/13/chartex" xmlns:cx8="http://schemas.microsoft.com/office/drawing/2016/5/14/chartex" xmlns:mc="http://schemas.openxmlformats.org/markup-compatibility/2006" xmlns:aink="http://schemas.microsoft.com/office/drawing/2016/ink" xmlns:am3d="http://schemas.microsoft.com/office/drawing/2017/model3d" xmlns:o="urn:schemas-microsoft-com:office:office" xmlns:oel="http://schemas.microsoft.com/office/2019/extlst" xmlns:r="http://schemas.openxmlformats.org/officeDocument/2006/relationships" xmlns:m="http://schemas.openxmlformats.org/officeDocument/2006/math" xmlns:v="urn:schemas-microsoft-com:vml" xmlns:wp14="http://schemas.microsoft.com/office/word/2010/wordprocessingDrawing" xmlns:wp="http://schemas.openxmlformats.org/drawingml/2006/wordprocessingDrawing" xmlns:w10="urn:schemas-microsoft-com:office:word" xmlns:w="http://schemas.openxmlformats.org/wordprocessingml/2006/main" xmlns:w14="http://schemas.microsoft.com/office/word/2010/wordml" xmlns:w15="http://schemas.microsoft.com/office/word/2012/wordml" xmlns:w16cex="http://schemas.microsoft.com/office/word/2018/wordml/cex" xmlns:w16cid="http://schemas.microsoft.com/office/word/2016/wordml/cid" xmlns:w16="http://schemas.microsoft.com/office/word/2018/wordml" xmlns:w16du="http://schemas.microsoft.com/office/word/2023/wordml/word16du" xmlns:w16sdtdh="http://schemas.microsoft.com/office/word/2020/wordml/sdtdatahash" xmlns:w16sdtfl="http://schemas.microsoft.com/office/word/2024/wordml/sdtformatlock" xmlns:w16se="http://schemas.microsoft.com/office/word/2015/wordml/symex" xmlns:wpg="http://schemas.microsoft.com/office/word/2010/wordprocessingGroup" xmlns:wpi="http://schemas.microsoft.com/office/word/2010/wordprocessingInk" xmlns:wne="http://schemas.microsoft.com/office/word/2006/wordml" xmlns:wps="http://schemas.microsoft.com/office/word/2010/wordprocessingShape" mc:Ignorable="w14 w15 w16se w16cid w16 w16cex w16sdtdh w16sdtfl w16du wp14">
-  <w:abstractNum w:abstractNumId="0" w15:restartNumberingAfterBreak="0">
+<w:numbering xmlns:ve="http://schemas.openxmlformats.org/markup-compatibility/2006" xmlns:o="urn:schemas-microsoft-com:office:office" xmlns:r="http://schemas.openxmlformats.org/officeDocument/2006/relationships" xmlns:m="http://schemas.openxmlformats.org/officeDocument/2006/math" xmlns:v="urn:schemas-microsoft-com:vml" xmlns:wp="http://schemas.openxmlformats.org/drawingml/2006/wordprocessingDrawing" xmlns:w10="urn:schemas-microsoft-com:office:word" xmlns:w="http://schemas.openxmlformats.org/wordprocessingml/2006/main" xmlns:wne="http://schemas.microsoft.com/office/word/2006/wordml">
+  <w:abstractNum w:abstractNumId="0">
     <w:nsid w:val="0288444A"/>
     <w:multiLevelType w:val="multilevel"/>
     <w:tmpl w:val="1DE4380C"/>
@@ -3799,7 +3778,7 @@
       </w:rPr>
     </w:lvl>
   </w:abstractNum>
-  <w:abstractNum w:abstractNumId="1" w15:restartNumberingAfterBreak="0">
+  <w:abstractNum w:abstractNumId="1">
     <w:nsid w:val="0A5C0C71"/>
     <w:multiLevelType w:val="multilevel"/>
     <w:tmpl w:val="DAFA454E"/>
@@ -3912,7 +3891,7 @@
       </w:pPr>
     </w:lvl>
   </w:abstractNum>
-  <w:abstractNum w:abstractNumId="2" w15:restartNumberingAfterBreak="0">
+  <w:abstractNum w:abstractNumId="2">
     <w:nsid w:val="0A760E20"/>
     <w:multiLevelType w:val="multilevel"/>
     <w:tmpl w:val="3A7035D2"/>
@@ -4061,7 +4040,7 @@
       </w:rPr>
     </w:lvl>
   </w:abstractNum>
-  <w:abstractNum w:abstractNumId="3" w15:restartNumberingAfterBreak="0">
+  <w:abstractNum w:abstractNumId="3">
     <w:nsid w:val="0C5C48D1"/>
     <w:multiLevelType w:val="multilevel"/>
     <w:tmpl w:val="78DE54D8"/>
@@ -4210,7 +4189,7 @@
       </w:rPr>
     </w:lvl>
   </w:abstractNum>
-  <w:abstractNum w:abstractNumId="4" w15:restartNumberingAfterBreak="0">
+  <w:abstractNum w:abstractNumId="4">
     <w:nsid w:val="0D883F70"/>
     <w:multiLevelType w:val="multilevel"/>
     <w:tmpl w:val="B3AAF6F8"/>
@@ -4359,7 +4338,7 @@
       </w:rPr>
     </w:lvl>
   </w:abstractNum>
-  <w:abstractNum w:abstractNumId="5" w15:restartNumberingAfterBreak="0">
+  <w:abstractNum w:abstractNumId="5">
     <w:nsid w:val="1A253B94"/>
     <w:multiLevelType w:val="multilevel"/>
     <w:tmpl w:val="B436329C"/>
@@ -4508,7 +4487,7 @@
       </w:rPr>
     </w:lvl>
   </w:abstractNum>
-  <w:abstractNum w:abstractNumId="6" w15:restartNumberingAfterBreak="0">
+  <w:abstractNum w:abstractNumId="6">
     <w:nsid w:val="1B0F5112"/>
     <w:multiLevelType w:val="multilevel"/>
     <w:tmpl w:val="B560D3A6"/>
@@ -4657,7 +4636,7 @@
       </w:rPr>
     </w:lvl>
   </w:abstractNum>
-  <w:abstractNum w:abstractNumId="7" w15:restartNumberingAfterBreak="0">
+  <w:abstractNum w:abstractNumId="7">
     <w:nsid w:val="1BF81FCA"/>
     <w:multiLevelType w:val="multilevel"/>
     <w:tmpl w:val="7C9A8CAA"/>
@@ -4806,7 +4785,7 @@
       </w:rPr>
     </w:lvl>
   </w:abstractNum>
-  <w:abstractNum w:abstractNumId="8" w15:restartNumberingAfterBreak="0">
+  <w:abstractNum w:abstractNumId="8">
     <w:nsid w:val="23716F87"/>
     <w:multiLevelType w:val="multilevel"/>
     <w:tmpl w:val="CFFEE8DE"/>
@@ -4955,7 +4934,7 @@
       </w:rPr>
     </w:lvl>
   </w:abstractNum>
-  <w:abstractNum w:abstractNumId="9" w15:restartNumberingAfterBreak="0">
+  <w:abstractNum w:abstractNumId="9">
     <w:nsid w:val="271877BA"/>
     <w:multiLevelType w:val="multilevel"/>
     <w:tmpl w:val="FBA200C6"/>
@@ -5068,7 +5047,7 @@
       </w:pPr>
     </w:lvl>
   </w:abstractNum>
-  <w:abstractNum w:abstractNumId="10" w15:restartNumberingAfterBreak="0">
+  <w:abstractNum w:abstractNumId="10">
     <w:nsid w:val="2D5E3A09"/>
     <w:multiLevelType w:val="multilevel"/>
     <w:tmpl w:val="3F8431F8"/>
@@ -5217,7 +5196,7 @@
       </w:rPr>
     </w:lvl>
   </w:abstractNum>
-  <w:abstractNum w:abstractNumId="11" w15:restartNumberingAfterBreak="0">
+  <w:abstractNum w:abstractNumId="11">
     <w:nsid w:val="34137A34"/>
     <w:multiLevelType w:val="multilevel"/>
     <w:tmpl w:val="C58AF480"/>
@@ -5366,7 +5345,7 @@
       </w:rPr>
     </w:lvl>
   </w:abstractNum>
-  <w:abstractNum w:abstractNumId="12" w15:restartNumberingAfterBreak="0">
+  <w:abstractNum w:abstractNumId="12">
     <w:nsid w:val="38460E58"/>
     <w:multiLevelType w:val="multilevel"/>
     <w:tmpl w:val="E8688824"/>
@@ -5515,7 +5494,7 @@
       </w:rPr>
     </w:lvl>
   </w:abstractNum>
-  <w:abstractNum w:abstractNumId="13" w15:restartNumberingAfterBreak="0">
+  <w:abstractNum w:abstractNumId="13">
     <w:nsid w:val="39302EF6"/>
     <w:multiLevelType w:val="multilevel"/>
     <w:tmpl w:val="7E060CD8"/>
@@ -5664,7 +5643,7 @@
       </w:rPr>
     </w:lvl>
   </w:abstractNum>
-  <w:abstractNum w:abstractNumId="14" w15:restartNumberingAfterBreak="0">
+  <w:abstractNum w:abstractNumId="14">
     <w:nsid w:val="42446E0B"/>
     <w:multiLevelType w:val="multilevel"/>
     <w:tmpl w:val="C9A2EC6C"/>
@@ -5813,7 +5792,7 @@
       </w:rPr>
     </w:lvl>
   </w:abstractNum>
-  <w:abstractNum w:abstractNumId="15" w15:restartNumberingAfterBreak="0">
+  <w:abstractNum w:abstractNumId="15">
     <w:nsid w:val="424B7D8F"/>
     <w:multiLevelType w:val="multilevel"/>
     <w:tmpl w:val="402892AC"/>
@@ -5962,7 +5941,7 @@
       </w:rPr>
     </w:lvl>
   </w:abstractNum>
-  <w:abstractNum w:abstractNumId="16" w15:restartNumberingAfterBreak="0">
+  <w:abstractNum w:abstractNumId="16">
     <w:nsid w:val="45423EAA"/>
     <w:multiLevelType w:val="multilevel"/>
     <w:tmpl w:val="782CCC4E"/>
@@ -6111,7 +6090,7 @@
       </w:rPr>
     </w:lvl>
   </w:abstractNum>
-  <w:abstractNum w:abstractNumId="17" w15:restartNumberingAfterBreak="0">
+  <w:abstractNum w:abstractNumId="17">
     <w:nsid w:val="4D086C2C"/>
     <w:multiLevelType w:val="multilevel"/>
     <w:tmpl w:val="5F82827A"/>
@@ -6228,7 +6207,7 @@
       </w:pPr>
     </w:lvl>
   </w:abstractNum>
-  <w:abstractNum w:abstractNumId="18" w15:restartNumberingAfterBreak="0">
+  <w:abstractNum w:abstractNumId="18">
     <w:nsid w:val="4DD06705"/>
     <w:multiLevelType w:val="multilevel"/>
     <w:tmpl w:val="FE76B64C"/>
@@ -6377,7 +6356,7 @@
       </w:rPr>
     </w:lvl>
   </w:abstractNum>
-  <w:abstractNum w:abstractNumId="19" w15:restartNumberingAfterBreak="0">
+  <w:abstractNum w:abstractNumId="19">
     <w:nsid w:val="4E7B0392"/>
     <w:multiLevelType w:val="multilevel"/>
     <w:tmpl w:val="4DD66C2A"/>
@@ -6526,7 +6505,7 @@
       </w:rPr>
     </w:lvl>
   </w:abstractNum>
-  <w:abstractNum w:abstractNumId="20" w15:restartNumberingAfterBreak="0">
+  <w:abstractNum w:abstractNumId="20">
     <w:nsid w:val="5014675B"/>
     <w:multiLevelType w:val="multilevel"/>
     <w:tmpl w:val="BFBABB88"/>
@@ -6675,7 +6654,7 @@
       </w:rPr>
     </w:lvl>
   </w:abstractNum>
-  <w:abstractNum w:abstractNumId="21" w15:restartNumberingAfterBreak="0">
+  <w:abstractNum w:abstractNumId="21">
     <w:nsid w:val="59556BDB"/>
     <w:multiLevelType w:val="multilevel"/>
     <w:tmpl w:val="221AB34E"/>
@@ -6824,7 +6803,7 @@
       </w:rPr>
     </w:lvl>
   </w:abstractNum>
-  <w:abstractNum w:abstractNumId="22" w15:restartNumberingAfterBreak="0">
+  <w:abstractNum w:abstractNumId="22">
     <w:nsid w:val="5A675B9D"/>
     <w:multiLevelType w:val="multilevel"/>
     <w:tmpl w:val="CFC0B7F2"/>
@@ -6973,7 +6952,7 @@
       </w:rPr>
     </w:lvl>
   </w:abstractNum>
-  <w:abstractNum w:abstractNumId="23" w15:restartNumberingAfterBreak="0">
+  <w:abstractNum w:abstractNumId="23">
     <w:nsid w:val="5C39334C"/>
     <w:multiLevelType w:val="multilevel"/>
     <w:tmpl w:val="5B26472C"/>
@@ -7122,7 +7101,7 @@
       </w:rPr>
     </w:lvl>
   </w:abstractNum>
-  <w:abstractNum w:abstractNumId="24" w15:restartNumberingAfterBreak="0">
+  <w:abstractNum w:abstractNumId="24">
     <w:nsid w:val="626508DB"/>
     <w:multiLevelType w:val="multilevel"/>
     <w:tmpl w:val="BE4888A8"/>
@@ -7271,7 +7250,7 @@
       </w:rPr>
     </w:lvl>
   </w:abstractNum>
-  <w:abstractNum w:abstractNumId="25" w15:restartNumberingAfterBreak="0">
+  <w:abstractNum w:abstractNumId="25">
     <w:nsid w:val="65F40E1A"/>
     <w:multiLevelType w:val="multilevel"/>
     <w:tmpl w:val="51187A08"/>
@@ -7420,7 +7399,7 @@
       </w:rPr>
     </w:lvl>
   </w:abstractNum>
-  <w:abstractNum w:abstractNumId="26" w15:restartNumberingAfterBreak="0">
+  <w:abstractNum w:abstractNumId="26">
     <w:nsid w:val="67F628F0"/>
     <w:multiLevelType w:val="multilevel"/>
     <w:tmpl w:val="6F3E3D46"/>
@@ -7569,7 +7548,7 @@
       </w:rPr>
     </w:lvl>
   </w:abstractNum>
-  <w:abstractNum w:abstractNumId="27" w15:restartNumberingAfterBreak="0">
+  <w:abstractNum w:abstractNumId="27">
     <w:nsid w:val="68EC78E8"/>
     <w:multiLevelType w:val="multilevel"/>
     <w:tmpl w:val="7730C96A"/>
@@ -7718,7 +7697,7 @@
       </w:rPr>
     </w:lvl>
   </w:abstractNum>
-  <w:abstractNum w:abstractNumId="28" w15:restartNumberingAfterBreak="0">
+  <w:abstractNum w:abstractNumId="28">
     <w:nsid w:val="6AD658A0"/>
     <w:multiLevelType w:val="multilevel"/>
     <w:tmpl w:val="9A1CD194"/>
@@ -7867,7 +7846,7 @@
       </w:rPr>
     </w:lvl>
   </w:abstractNum>
-  <w:abstractNum w:abstractNumId="29" w15:restartNumberingAfterBreak="0">
+  <w:abstractNum w:abstractNumId="29">
     <w:nsid w:val="70106728"/>
     <w:multiLevelType w:val="multilevel"/>
     <w:tmpl w:val="4D9836BA"/>
@@ -8016,7 +7995,7 @@
       </w:rPr>
     </w:lvl>
   </w:abstractNum>
-  <w:abstractNum w:abstractNumId="30" w15:restartNumberingAfterBreak="0">
+  <w:abstractNum w:abstractNumId="30">
     <w:nsid w:val="71E4101A"/>
     <w:multiLevelType w:val="multilevel"/>
     <w:tmpl w:val="B5C4AC50"/>
@@ -8165,7 +8144,7 @@
       </w:rPr>
     </w:lvl>
   </w:abstractNum>
-  <w:abstractNum w:abstractNumId="31" w15:restartNumberingAfterBreak="0">
+  <w:abstractNum w:abstractNumId="31">
     <w:nsid w:val="736E137C"/>
     <w:multiLevelType w:val="multilevel"/>
     <w:tmpl w:val="73B4451E"/>
@@ -8314,7 +8293,7 @@
       </w:rPr>
     </w:lvl>
   </w:abstractNum>
-  <w:abstractNum w:abstractNumId="32" w15:restartNumberingAfterBreak="0">
+  <w:abstractNum w:abstractNumId="32">
     <w:nsid w:val="77A71667"/>
     <w:multiLevelType w:val="multilevel"/>
     <w:tmpl w:val="3422495A"/>
@@ -8463,7 +8442,7 @@
       </w:rPr>
     </w:lvl>
   </w:abstractNum>
-  <w:abstractNum w:abstractNumId="33" w15:restartNumberingAfterBreak="0">
+  <w:abstractNum w:abstractNumId="33">
     <w:nsid w:val="7830191C"/>
     <w:multiLevelType w:val="multilevel"/>
     <w:tmpl w:val="F640B074"/>
@@ -8612,7 +8591,7 @@
       </w:rPr>
     </w:lvl>
   </w:abstractNum>
-  <w:abstractNum w:abstractNumId="34" w15:restartNumberingAfterBreak="0">
+  <w:abstractNum w:abstractNumId="34">
     <w:nsid w:val="7A05657C"/>
     <w:multiLevelType w:val="multilevel"/>
     <w:tmpl w:val="3F367B7E"/>
@@ -8761,116 +8740,116 @@
       </w:rPr>
     </w:lvl>
   </w:abstractNum>
-  <w:num w:numId="1" w16cid:durableId="28998018">
+  <w:num w:numId="1">
     <w:abstractNumId w:val="18"/>
   </w:num>
-  <w:num w:numId="2" w16cid:durableId="756101803">
+  <w:num w:numId="2">
     <w:abstractNumId w:val="11"/>
   </w:num>
-  <w:num w:numId="3" w16cid:durableId="1265262923">
+  <w:num w:numId="3">
     <w:abstractNumId w:val="32"/>
   </w:num>
-  <w:num w:numId="4" w16cid:durableId="1910454705">
+  <w:num w:numId="4">
     <w:abstractNumId w:val="17"/>
   </w:num>
-  <w:num w:numId="5" w16cid:durableId="541137967">
+  <w:num w:numId="5">
     <w:abstractNumId w:val="1"/>
   </w:num>
-  <w:num w:numId="6" w16cid:durableId="1938979750">
+  <w:num w:numId="6">
     <w:abstractNumId w:val="29"/>
   </w:num>
-  <w:num w:numId="7" w16cid:durableId="535388577">
+  <w:num w:numId="7">
     <w:abstractNumId w:val="24"/>
   </w:num>
-  <w:num w:numId="8" w16cid:durableId="565797474">
+  <w:num w:numId="8">
     <w:abstractNumId w:val="6"/>
   </w:num>
-  <w:num w:numId="9" w16cid:durableId="175509049">
+  <w:num w:numId="9">
     <w:abstractNumId w:val="4"/>
   </w:num>
-  <w:num w:numId="10" w16cid:durableId="680351452">
+  <w:num w:numId="10">
     <w:abstractNumId w:val="15"/>
   </w:num>
-  <w:num w:numId="11" w16cid:durableId="130485980">
+  <w:num w:numId="11">
     <w:abstractNumId w:val="30"/>
   </w:num>
-  <w:num w:numId="12" w16cid:durableId="1824856102">
+  <w:num w:numId="12">
     <w:abstractNumId w:val="20"/>
   </w:num>
-  <w:num w:numId="13" w16cid:durableId="611518175">
+  <w:num w:numId="13">
     <w:abstractNumId w:val="10"/>
   </w:num>
-  <w:num w:numId="14" w16cid:durableId="298071734">
+  <w:num w:numId="14">
     <w:abstractNumId w:val="21"/>
   </w:num>
-  <w:num w:numId="15" w16cid:durableId="1889684417">
+  <w:num w:numId="15">
     <w:abstractNumId w:val="7"/>
   </w:num>
-  <w:num w:numId="16" w16cid:durableId="2042851556">
+  <w:num w:numId="16">
     <w:abstractNumId w:val="33"/>
   </w:num>
-  <w:num w:numId="17" w16cid:durableId="146287628">
+  <w:num w:numId="17">
     <w:abstractNumId w:val="5"/>
   </w:num>
-  <w:num w:numId="18" w16cid:durableId="38018241">
+  <w:num w:numId="18">
     <w:abstractNumId w:val="34"/>
   </w:num>
-  <w:num w:numId="19" w16cid:durableId="772407738">
+  <w:num w:numId="19">
     <w:abstractNumId w:val="22"/>
   </w:num>
-  <w:num w:numId="20" w16cid:durableId="1194617688">
+  <w:num w:numId="20">
     <w:abstractNumId w:val="27"/>
   </w:num>
-  <w:num w:numId="21" w16cid:durableId="1790051943">
+  <w:num w:numId="21">
     <w:abstractNumId w:val="28"/>
   </w:num>
-  <w:num w:numId="22" w16cid:durableId="2062095374">
+  <w:num w:numId="22">
     <w:abstractNumId w:val="19"/>
   </w:num>
-  <w:num w:numId="23" w16cid:durableId="549612912">
+  <w:num w:numId="23">
     <w:abstractNumId w:val="8"/>
   </w:num>
-  <w:num w:numId="24" w16cid:durableId="837230342">
+  <w:num w:numId="24">
     <w:abstractNumId w:val="12"/>
   </w:num>
-  <w:num w:numId="25" w16cid:durableId="1501046360">
+  <w:num w:numId="25">
     <w:abstractNumId w:val="23"/>
   </w:num>
-  <w:num w:numId="26" w16cid:durableId="1023895689">
+  <w:num w:numId="26">
     <w:abstractNumId w:val="16"/>
   </w:num>
-  <w:num w:numId="27" w16cid:durableId="1966614629">
+  <w:num w:numId="27">
     <w:abstractNumId w:val="9"/>
   </w:num>
-  <w:num w:numId="28" w16cid:durableId="377822249">
+  <w:num w:numId="28">
     <w:abstractNumId w:val="26"/>
   </w:num>
-  <w:num w:numId="29" w16cid:durableId="190723424">
+  <w:num w:numId="29">
     <w:abstractNumId w:val="2"/>
   </w:num>
-  <w:num w:numId="30" w16cid:durableId="1979915625">
+  <w:num w:numId="30">
     <w:abstractNumId w:val="25"/>
   </w:num>
-  <w:num w:numId="31" w16cid:durableId="2088071123">
+  <w:num w:numId="31">
     <w:abstractNumId w:val="31"/>
   </w:num>
-  <w:num w:numId="32" w16cid:durableId="32927861">
+  <w:num w:numId="32">
     <w:abstractNumId w:val="13"/>
   </w:num>
-  <w:num w:numId="33" w16cid:durableId="992683320">
+  <w:num w:numId="33">
     <w:abstractNumId w:val="3"/>
   </w:num>
-  <w:num w:numId="34" w16cid:durableId="981233345">
+  <w:num w:numId="34">
     <w:abstractNumId w:val="0"/>
   </w:num>
-  <w:num w:numId="35" w16cid:durableId="991106657">
+  <w:num w:numId="35">
     <w:abstractNumId w:val="14"/>
   </w:num>
 </w:numbering>
 </file>
 
 <file path=word/styles.xml><?xml version="1.0" encoding="utf-8"?>
-<w:styles xmlns:mc="http://schemas.openxmlformats.org/markup-compatibility/2006" xmlns:r="http://schemas.openxmlformats.org/officeDocument/2006/relationships" xmlns:w="http://schemas.openxmlformats.org/wordprocessingml/2006/main" xmlns:w14="http://schemas.microsoft.com/office/word/2010/wordml" xmlns:w15="http://schemas.microsoft.com/office/word/2012/wordml" xmlns:w16cex="http://schemas.microsoft.com/office/word/2018/wordml/cex" xmlns:w16cid="http://schemas.microsoft.com/office/word/2016/wordml/cid" xmlns:w16="http://schemas.microsoft.com/office/word/2018/wordml" xmlns:w16du="http://schemas.microsoft.com/office/word/2023/wordml/word16du" xmlns:w16sdtdh="http://schemas.microsoft.com/office/word/2020/wordml/sdtdatahash" xmlns:w16sdtfl="http://schemas.microsoft.com/office/word/2024/wordml/sdtformatlock" xmlns:w16se="http://schemas.microsoft.com/office/word/2015/wordml/symex" mc:Ignorable="w14 w15 w16se w16cid w16 w16cex w16sdtdh w16sdtfl w16du">
+<w:styles xmlns:r="http://schemas.openxmlformats.org/officeDocument/2006/relationships" xmlns:w="http://schemas.openxmlformats.org/wordprocessingml/2006/main">
   <w:docDefaults>
     <w:rPrDefault>
       <w:rPr>
@@ -8879,7 +8858,6 @@
         <w:sz w:val="22"/>
         <w:szCs w:val="28"/>
         <w:lang w:val="en-IN" w:eastAsia="en-US" w:bidi="th-TH"/>
-        <w14:ligatures w14:val="standardContextual"/>
       </w:rPr>
     </w:rPrDefault>
     <w:pPrDefault>
@@ -8888,387 +8866,149 @@
       </w:pPr>
     </w:pPrDefault>
   </w:docDefaults>
-  <w:latentStyles w:defLockedState="0" w:defUIPriority="99" w:defSemiHidden="0" w:defUnhideWhenUsed="0" w:defQFormat="0" w:count="376">
-    <w:lsdException w:name="Normal" w:uiPriority="0" w:qFormat="1"/>
-    <w:lsdException w:name="heading 1" w:uiPriority="9" w:qFormat="1"/>
-    <w:lsdException w:name="heading 2" w:semiHidden="1" w:uiPriority="9" w:unhideWhenUsed="1" w:qFormat="1"/>
-    <w:lsdException w:name="heading 3" w:semiHidden="1" w:uiPriority="9" w:unhideWhenUsed="1" w:qFormat="1"/>
-    <w:lsdException w:name="heading 4" w:semiHidden="1" w:uiPriority="9" w:unhideWhenUsed="1" w:qFormat="1"/>
-    <w:lsdException w:name="heading 5" w:semiHidden="1" w:uiPriority="9" w:unhideWhenUsed="1" w:qFormat="1"/>
-    <w:lsdException w:name="heading 6" w:semiHidden="1" w:uiPriority="9" w:unhideWhenUsed="1" w:qFormat="1"/>
-    <w:lsdException w:name="heading 7" w:semiHidden="1" w:uiPriority="9" w:unhideWhenUsed="1" w:qFormat="1"/>
-    <w:lsdException w:name="heading 8" w:semiHidden="1" w:uiPriority="9" w:unhideWhenUsed="1" w:qFormat="1"/>
-    <w:lsdException w:name="heading 9" w:semiHidden="1" w:uiPriority="9" w:unhideWhenUsed="1" w:qFormat="1"/>
-    <w:lsdException w:name="index 1" w:semiHidden="1" w:unhideWhenUsed="1"/>
-    <w:lsdException w:name="index 2" w:semiHidden="1" w:unhideWhenUsed="1"/>
-    <w:lsdException w:name="index 3" w:semiHidden="1" w:unhideWhenUsed="1"/>
-    <w:lsdException w:name="index 4" w:semiHidden="1" w:unhideWhenUsed="1"/>
-    <w:lsdException w:name="index 5" w:semiHidden="1" w:unhideWhenUsed="1"/>
-    <w:lsdException w:name="index 6" w:semiHidden="1" w:unhideWhenUsed="1"/>
-    <w:lsdException w:name="index 7" w:semiHidden="1" w:unhideWhenUsed="1"/>
-    <w:lsdException w:name="index 8" w:semiHidden="1" w:unhideWhenUsed="1"/>
-    <w:lsdException w:name="index 9" w:semiHidden="1" w:unhideWhenUsed="1"/>
-    <w:lsdException w:name="toc 1" w:semiHidden="1" w:uiPriority="39" w:unhideWhenUsed="1"/>
-    <w:lsdException w:name="toc 2" w:semiHidden="1" w:uiPriority="39" w:unhideWhenUsed="1"/>
-    <w:lsdException w:name="toc 3" w:semiHidden="1" w:uiPriority="39" w:unhideWhenUsed="1"/>
-    <w:lsdException w:name="toc 4" w:semiHidden="1" w:uiPriority="39" w:unhideWhenUsed="1"/>
-    <w:lsdException w:name="toc 5" w:semiHidden="1" w:uiPriority="39" w:unhideWhenUsed="1"/>
-    <w:lsdException w:name="toc 6" w:semiHidden="1" w:uiPriority="39" w:unhideWhenUsed="1"/>
-    <w:lsdException w:name="toc 7" w:semiHidden="1" w:uiPriority="39" w:unhideWhenUsed="1"/>
-    <w:lsdException w:name="toc 8" w:semiHidden="1" w:uiPriority="39" w:unhideWhenUsed="1"/>
-    <w:lsdException w:name="toc 9" w:semiHidden="1" w:uiPriority="39" w:unhideWhenUsed="1"/>
-    <w:lsdException w:name="Normal Indent" w:semiHidden="1" w:unhideWhenUsed="1"/>
-    <w:lsdException w:name="footnote text" w:semiHidden="1" w:unhideWhenUsed="1"/>
-    <w:lsdException w:name="annotation text" w:semiHidden="1" w:unhideWhenUsed="1"/>
-    <w:lsdException w:name="header" w:semiHidden="1" w:unhideWhenUsed="1"/>
-    <w:lsdException w:name="footer" w:semiHidden="1" w:unhideWhenUsed="1"/>
-    <w:lsdException w:name="index heading" w:semiHidden="1" w:unhideWhenUsed="1"/>
-    <w:lsdException w:name="caption" w:semiHidden="1" w:uiPriority="35" w:unhideWhenUsed="1" w:qFormat="1"/>
-    <w:lsdException w:name="table of figures" w:semiHidden="1" w:unhideWhenUsed="1"/>
-    <w:lsdException w:name="envelope address" w:semiHidden="1" w:unhideWhenUsed="1"/>
-    <w:lsdException w:name="envelope return" w:semiHidden="1" w:unhideWhenUsed="1"/>
-    <w:lsdException w:name="footnote reference" w:semiHidden="1" w:unhideWhenUsed="1"/>
-    <w:lsdException w:name="annotation reference" w:semiHidden="1" w:unhideWhenUsed="1"/>
-    <w:lsdException w:name="line number" w:semiHidden="1" w:unhideWhenUsed="1"/>
-    <w:lsdException w:name="page number" w:semiHidden="1" w:unhideWhenUsed="1"/>
-    <w:lsdException w:name="endnote reference" w:semiHidden="1" w:unhideWhenUsed="1"/>
-    <w:lsdException w:name="endnote text" w:semiHidden="1" w:unhideWhenUsed="1"/>
-    <w:lsdException w:name="table of authorities" w:semiHidden="1" w:unhideWhenUsed="1"/>
-    <w:lsdException w:name="macro" w:semiHidden="1" w:unhideWhenUsed="1"/>
-    <w:lsdException w:name="toa heading" w:semiHidden="1" w:unhideWhenUsed="1"/>
-    <w:lsdException w:name="List" w:semiHidden="1" w:unhideWhenUsed="1"/>
-    <w:lsdException w:name="List Bullet" w:semiHidden="1" w:unhideWhenUsed="1"/>
-    <w:lsdException w:name="List Number" w:semiHidden="1" w:unhideWhenUsed="1"/>
-    <w:lsdException w:name="List 2" w:semiHidden="1" w:unhideWhenUsed="1"/>
-    <w:lsdException w:name="List 3" w:semiHidden="1" w:unhideWhenUsed="1"/>
-    <w:lsdException w:name="List 4" w:semiHidden="1" w:unhideWhenUsed="1"/>
-    <w:lsdException w:name="List 5" w:semiHidden="1" w:unhideWhenUsed="1"/>
-    <w:lsdException w:name="List Bullet 2" w:semiHidden="1" w:unhideWhenUsed="1"/>
-    <w:lsdException w:name="List Bullet 3" w:semiHidden="1" w:unhideWhenUsed="1"/>
-    <w:lsdException w:name="List Bullet 4" w:semiHidden="1" w:unhideWhenUsed="1"/>
-    <w:lsdException w:name="List Bullet 5" w:semiHidden="1" w:unhideWhenUsed="1"/>
-    <w:lsdException w:name="List Number 2" w:semiHidden="1" w:unhideWhenUsed="1"/>
-    <w:lsdException w:name="List Number 3" w:semiHidden="1" w:unhideWhenUsed="1"/>
-    <w:lsdException w:name="List Number 4" w:semiHidden="1" w:unhideWhenUsed="1"/>
-    <w:lsdException w:name="List Number 5" w:semiHidden="1" w:unhideWhenUsed="1"/>
-    <w:lsdException w:name="Title" w:uiPriority="10" w:qFormat="1"/>
-    <w:lsdException w:name="Closing" w:semiHidden="1" w:unhideWhenUsed="1"/>
-    <w:lsdException w:name="Signature" w:semiHidden="1" w:unhideWhenUsed="1"/>
-    <w:lsdException w:name="Default Paragraph Font" w:semiHidden="1" w:uiPriority="1" w:unhideWhenUsed="1"/>
-    <w:lsdException w:name="Body Text" w:semiHidden="1" w:unhideWhenUsed="1"/>
-    <w:lsdException w:name="Body Text Indent" w:semiHidden="1" w:unhideWhenUsed="1"/>
-    <w:lsdException w:name="List Continue" w:semiHidden="1" w:unhideWhenUsed="1"/>
-    <w:lsdException w:name="List Continue 2" w:semiHidden="1" w:unhideWhenUsed="1"/>
-    <w:lsdException w:name="List Continue 3" w:semiHidden="1" w:unhideWhenUsed="1"/>
-    <w:lsdException w:name="List Continue 4" w:semiHidden="1" w:unhideWhenUsed="1"/>
-    <w:lsdException w:name="List Continue 5" w:semiHidden="1" w:unhideWhenUsed="1"/>
-    <w:lsdException w:name="Message Header" w:semiHidden="1" w:unhideWhenUsed="1"/>
-    <w:lsdException w:name="Subtitle" w:uiPriority="11" w:qFormat="1"/>
-    <w:lsdException w:name="Salutation" w:semiHidden="1" w:unhideWhenUsed="1"/>
-    <w:lsdException w:name="Date" w:semiHidden="1" w:unhideWhenUsed="1"/>
-    <w:lsdException w:name="Body Text First Indent" w:semiHidden="1" w:unhideWhenUsed="1"/>
-    <w:lsdException w:name="Body Text First Indent 2" w:semiHidden="1" w:unhideWhenUsed="1"/>
-    <w:lsdException w:name="Note Heading" w:semiHidden="1" w:unhideWhenUsed="1"/>
-    <w:lsdException w:name="Body Text 2" w:semiHidden="1" w:unhideWhenUsed="1"/>
-    <w:lsdException w:name="Body Text 3" w:semiHidden="1" w:unhideWhenUsed="1"/>
-    <w:lsdException w:name="Body Text Indent 2" w:semiHidden="1" w:unhideWhenUsed="1"/>
-    <w:lsdException w:name="Body Text Indent 3" w:semiHidden="1" w:unhideWhenUsed="1"/>
-    <w:lsdException w:name="Block Text" w:semiHidden="1" w:unhideWhenUsed="1"/>
-    <w:lsdException w:name="Hyperlink" w:semiHidden="1" w:unhideWhenUsed="1"/>
-    <w:lsdException w:name="FollowedHyperlink" w:semiHidden="1" w:unhideWhenUsed="1"/>
-    <w:lsdException w:name="Strong" w:uiPriority="22" w:qFormat="1"/>
-    <w:lsdException w:name="Emphasis" w:uiPriority="20" w:qFormat="1"/>
-    <w:lsdException w:name="Document Map" w:semiHidden="1" w:unhideWhenUsed="1"/>
-    <w:lsdException w:name="Plain Text" w:semiHidden="1" w:unhideWhenUsed="1"/>
-    <w:lsdException w:name="E-mail Signature" w:semiHidden="1" w:unhideWhenUsed="1"/>
-    <w:lsdException w:name="HTML Top of Form" w:semiHidden="1" w:unhideWhenUsed="1"/>
-    <w:lsdException w:name="HTML Bottom of Form" w:semiHidden="1" w:unhideWhenUsed="1"/>
-    <w:lsdException w:name="Normal (Web)" w:semiHidden="1" w:unhideWhenUsed="1"/>
-    <w:lsdException w:name="HTML Acronym" w:semiHidden="1" w:unhideWhenUsed="1"/>
-    <w:lsdException w:name="HTML Address" w:semiHidden="1" w:unhideWhenUsed="1"/>
-    <w:lsdException w:name="HTML Cite" w:semiHidden="1" w:unhideWhenUsed="1"/>
-    <w:lsdException w:name="HTML Code" w:semiHidden="1" w:unhideWhenUsed="1"/>
-    <w:lsdException w:name="HTML Definition" w:semiHidden="1" w:unhideWhenUsed="1"/>
-    <w:lsdException w:name="HTML Keyboard" w:semiHidden="1" w:unhideWhenUsed="1"/>
-    <w:lsdException w:name="HTML Preformatted" w:semiHidden="1" w:unhideWhenUsed="1"/>
-    <w:lsdException w:name="HTML Sample" w:semiHidden="1" w:unhideWhenUsed="1"/>
-    <w:lsdException w:name="HTML Typewriter" w:semiHidden="1" w:unhideWhenUsed="1"/>
-    <w:lsdException w:name="HTML Variable" w:semiHidden="1" w:unhideWhenUsed="1"/>
-    <w:lsdException w:name="Normal Table" w:semiHidden="1" w:unhideWhenUsed="1"/>
-    <w:lsdException w:name="annotation subject" w:semiHidden="1" w:unhideWhenUsed="1"/>
-    <w:lsdException w:name="No List" w:semiHidden="1" w:unhideWhenUsed="1"/>
-    <w:lsdException w:name="Outline List 1" w:semiHidden="1" w:unhideWhenUsed="1"/>
-    <w:lsdException w:name="Outline List 2" w:semiHidden="1" w:unhideWhenUsed="1"/>
-    <w:lsdException w:name="Outline List 3" w:semiHidden="1" w:unhideWhenUsed="1"/>
-    <w:lsdException w:name="Table Simple 1" w:semiHidden="1" w:unhideWhenUsed="1"/>
-    <w:lsdException w:name="Table Simple 2" w:semiHidden="1" w:unhideWhenUsed="1"/>
-    <w:lsdException w:name="Table Simple 3" w:semiHidden="1" w:unhideWhenUsed="1"/>
-    <w:lsdException w:name="Table Classic 1" w:semiHidden="1" w:unhideWhenUsed="1"/>
-    <w:lsdException w:name="Table Classic 2" w:semiHidden="1" w:unhideWhenUsed="1"/>
-    <w:lsdException w:name="Table Classic 3" w:semiHidden="1" w:unhideWhenUsed="1"/>
-    <w:lsdException w:name="Table Classic 4" w:semiHidden="1" w:unhideWhenUsed="1"/>
-    <w:lsdException w:name="Table Colorful 1" w:semiHidden="1" w:unhideWhenUsed="1"/>
-    <w:lsdException w:name="Table Colorful 2" w:semiHidden="1" w:unhideWhenUsed="1"/>
-    <w:lsdException w:name="Table Colorful 3" w:semiHidden="1" w:unhideWhenUsed="1"/>
-    <w:lsdException w:name="Table Columns 1" w:semiHidden="1" w:unhideWhenUsed="1"/>
-    <w:lsdException w:name="Table Columns 2" w:semiHidden="1" w:unhideWhenUsed="1"/>
-    <w:lsdException w:name="Table Columns 3" w:semiHidden="1" w:unhideWhenUsed="1"/>
-    <w:lsdException w:name="Table Columns 4" w:semiHidden="1" w:unhideWhenUsed="1"/>
-    <w:lsdException w:name="Table Columns 5" w:semiHidden="1" w:unhideWhenUsed="1"/>
-    <w:lsdException w:name="Table Grid 1" w:semiHidden="1" w:unhideWhenUsed="1"/>
-    <w:lsdException w:name="Table Grid 2" w:semiHidden="1" w:unhideWhenUsed="1"/>
-    <w:lsdException w:name="Table Grid 3" w:semiHidden="1" w:unhideWhenUsed="1"/>
-    <w:lsdException w:name="Table Grid 4" w:semiHidden="1" w:unhideWhenUsed="1"/>
-    <w:lsdException w:name="Table Grid 5" w:semiHidden="1" w:unhideWhenUsed="1"/>
-    <w:lsdException w:name="Table Grid 6" w:semiHidden="1" w:unhideWhenUsed="1"/>
-    <w:lsdException w:name="Table Grid 7" w:semiHidden="1" w:unhideWhenUsed="1"/>
-    <w:lsdException w:name="Table Grid 8" w:semiHidden="1" w:unhideWhenUsed="1"/>
-    <w:lsdException w:name="Table List 1" w:semiHidden="1" w:unhideWhenUsed="1"/>
-    <w:lsdException w:name="Table List 2" w:semiHidden="1" w:unhideWhenUsed="1"/>
-    <w:lsdException w:name="Table List 3" w:semiHidden="1" w:unhideWhenUsed="1"/>
-    <w:lsdException w:name="Table List 4" w:semiHidden="1" w:unhideWhenUsed="1"/>
-    <w:lsdException w:name="Table List 5" w:semiHidden="1" w:unhideWhenUsed="1"/>
-    <w:lsdException w:name="Table List 6" w:semiHidden="1" w:unhideWhenUsed="1"/>
-    <w:lsdException w:name="Table List 7" w:semiHidden="1" w:unhideWhenUsed="1"/>
-    <w:lsdException w:name="Table List 8" w:semiHidden="1" w:unhideWhenUsed="1"/>
-    <w:lsdException w:name="Table 3D effects 1" w:semiHidden="1" w:unhideWhenUsed="1"/>
-    <w:lsdException w:name="Table 3D effects 2" w:semiHidden="1" w:unhideWhenUsed="1"/>
-    <w:lsdException w:name="Table 3D effects 3" w:semiHidden="1" w:unhideWhenUsed="1"/>
-    <w:lsdException w:name="Table Contemporary" w:semiHidden="1" w:unhideWhenUsed="1"/>
-    <w:lsdException w:name="Table Elegant" w:semiHidden="1" w:unhideWhenUsed="1"/>
-    <w:lsdException w:name="Table Professional" w:semiHidden="1" w:unhideWhenUsed="1"/>
-    <w:lsdException w:name="Table Subtle 1" w:semiHidden="1" w:unhideWhenUsed="1"/>
-    <w:lsdException w:name="Table Subtle 2" w:semiHidden="1" w:unhideWhenUsed="1"/>
-    <w:lsdException w:name="Table Web 1" w:semiHidden="1" w:unhideWhenUsed="1"/>
-    <w:lsdException w:name="Table Web 2" w:semiHidden="1" w:unhideWhenUsed="1"/>
-    <w:lsdException w:name="Table Web 3" w:semiHidden="1" w:unhideWhenUsed="1"/>
-    <w:lsdException w:name="Balloon Text" w:semiHidden="1" w:unhideWhenUsed="1"/>
-    <w:lsdException w:name="Table Grid" w:uiPriority="39"/>
-    <w:lsdException w:name="Table Theme" w:semiHidden="1" w:unhideWhenUsed="1"/>
-    <w:lsdException w:name="Placeholder Text" w:semiHidden="1"/>
-    <w:lsdException w:name="No Spacing" w:uiPriority="1" w:qFormat="1"/>
-    <w:lsdException w:name="Light Shading" w:uiPriority="60"/>
-    <w:lsdException w:name="Light List" w:uiPriority="61"/>
-    <w:lsdException w:name="Light Grid" w:uiPriority="62"/>
-    <w:lsdException w:name="Medium Shading 1" w:uiPriority="63"/>
-    <w:lsdException w:name="Medium Shading 2" w:uiPriority="64"/>
-    <w:lsdException w:name="Medium List 1" w:uiPriority="65"/>
-    <w:lsdException w:name="Medium List 2" w:uiPriority="66"/>
-    <w:lsdException w:name="Medium Grid 1" w:uiPriority="67"/>
-    <w:lsdException w:name="Medium Grid 2" w:uiPriority="68"/>
-    <w:lsdException w:name="Medium Grid 3" w:uiPriority="69"/>
-    <w:lsdException w:name="Dark List" w:uiPriority="70"/>
-    <w:lsdException w:name="Colorful Shading" w:uiPriority="71"/>
-    <w:lsdException w:name="Colorful List" w:uiPriority="72"/>
-    <w:lsdException w:name="Colorful Grid" w:uiPriority="73"/>
-    <w:lsdException w:name="Light Shading Accent 1" w:uiPriority="60"/>
-    <w:lsdException w:name="Light List Accent 1" w:uiPriority="61"/>
-    <w:lsdException w:name="Light Grid Accent 1" w:uiPriority="62"/>
-    <w:lsdException w:name="Medium Shading 1 Accent 1" w:uiPriority="63"/>
-    <w:lsdException w:name="Medium Shading 2 Accent 1" w:uiPriority="64"/>
-    <w:lsdException w:name="Medium List 1 Accent 1" w:uiPriority="65"/>
-    <w:lsdException w:name="Revision" w:semiHidden="1"/>
-    <w:lsdException w:name="List Paragraph" w:uiPriority="34" w:qFormat="1"/>
-    <w:lsdException w:name="Quote" w:uiPriority="29" w:qFormat="1"/>
-    <w:lsdException w:name="Intense Quote" w:uiPriority="30" w:qFormat="1"/>
-    <w:lsdException w:name="Medium List 2 Accent 1" w:uiPriority="66"/>
-    <w:lsdException w:name="Medium Grid 1 Accent 1" w:uiPriority="67"/>
-    <w:lsdException w:name="Medium Grid 2 Accent 1" w:uiPriority="68"/>
-    <w:lsdException w:name="Medium Grid 3 Accent 1" w:uiPriority="69"/>
-    <w:lsdException w:name="Dark List Accent 1" w:uiPriority="70"/>
-    <w:lsdException w:name="Colorful Shading Accent 1" w:uiPriority="71"/>
-    <w:lsdException w:name="Colorful List Accent 1" w:uiPriority="72"/>
-    <w:lsdException w:name="Colorful Grid Accent 1" w:uiPriority="73"/>
-    <w:lsdException w:name="Light Shading Accent 2" w:uiPriority="60"/>
-    <w:lsdException w:name="Light List Accent 2" w:uiPriority="61"/>
-    <w:lsdException w:name="Light Grid Accent 2" w:uiPriority="62"/>
-    <w:lsdException w:name="Medium Shading 1 Accent 2" w:uiPriority="63"/>
-    <w:lsdException w:name="Medium Shading 2 Accent 2" w:uiPriority="64"/>
-    <w:lsdException w:name="Medium List 1 Accent 2" w:uiPriority="65"/>
-    <w:lsdException w:name="Medium List 2 Accent 2" w:uiPriority="66"/>
-    <w:lsdException w:name="Medium Grid 1 Accent 2" w:uiPriority="67"/>
-    <w:lsdException w:name="Medium Grid 2 Accent 2" w:uiPriority="68"/>
-    <w:lsdException w:name="Medium Grid 3 Accent 2" w:uiPriority="69"/>
-    <w:lsdException w:name="Dark List Accent 2" w:uiPriority="70"/>
-    <w:lsdException w:name="Colorful Shading Accent 2" w:uiPriority="71"/>
-    <w:lsdException w:name="Colorful List Accent 2" w:uiPriority="72"/>
-    <w:lsdException w:name="Colorful Grid Accent 2" w:uiPriority="73"/>
-    <w:lsdException w:name="Light Shading Accent 3" w:uiPriority="60"/>
-    <w:lsdException w:name="Light List Accent 3" w:uiPriority="61"/>
-    <w:lsdException w:name="Light Grid Accent 3" w:uiPriority="62"/>
-    <w:lsdException w:name="Medium Shading 1 Accent 3" w:uiPriority="63"/>
-    <w:lsdException w:name="Medium Shading 2 Accent 3" w:uiPriority="64"/>
-    <w:lsdException w:name="Medium List 1 Accent 3" w:uiPriority="65"/>
-    <w:lsdException w:name="Medium List 2 Accent 3" w:uiPriority="66"/>
-    <w:lsdException w:name="Medium Grid 1 Accent 3" w:uiPriority="67"/>
-    <w:lsdException w:name="Medium Grid 2 Accent 3" w:uiPriority="68"/>
-    <w:lsdException w:name="Medium Grid 3 Accent 3" w:uiPriority="69"/>
-    <w:lsdException w:name="Dark List Accent 3" w:uiPriority="70"/>
-    <w:lsdException w:name="Colorful Shading Accent 3" w:uiPriority="71"/>
-    <w:lsdException w:name="Colorful List Accent 3" w:uiPriority="72"/>
-    <w:lsdException w:name="Colorful Grid Accent 3" w:uiPriority="73"/>
-    <w:lsdException w:name="Light Shading Accent 4" w:uiPriority="60"/>
-    <w:lsdException w:name="Light List Accent 4" w:uiPriority="61"/>
-    <w:lsdException w:name="Light Grid Accent 4" w:uiPriority="62"/>
-    <w:lsdException w:name="Medium Shading 1 Accent 4" w:uiPriority="63"/>
-    <w:lsdException w:name="Medium Shading 2 Accent 4" w:uiPriority="64"/>
-    <w:lsdException w:name="Medium List 1 Accent 4" w:uiPriority="65"/>
-    <w:lsdException w:name="Medium List 2 Accent 4" w:uiPriority="66"/>
-    <w:lsdException w:name="Medium Grid 1 Accent 4" w:uiPriority="67"/>
-    <w:lsdException w:name="Medium Grid 2 Accent 4" w:uiPriority="68"/>
-    <w:lsdException w:name="Medium Grid 3 Accent 4" w:uiPriority="69"/>
-    <w:lsdException w:name="Dark List Accent 4" w:uiPriority="70"/>
-    <w:lsdException w:name="Colorful Shading Accent 4" w:uiPriority="71"/>
-    <w:lsdException w:name="Colorful List Accent 4" w:uiPriority="72"/>
-    <w:lsdException w:name="Colorful Grid Accent 4" w:uiPriority="73"/>
-    <w:lsdException w:name="Light Shading Accent 5" w:uiPriority="60"/>
-    <w:lsdException w:name="Light List Accent 5" w:uiPriority="61"/>
-    <w:lsdException w:name="Light Grid Accent 5" w:uiPriority="62"/>
-    <w:lsdException w:name="Medium Shading 1 Accent 5" w:uiPriority="63"/>
-    <w:lsdException w:name="Medium Shading 2 Accent 5" w:uiPriority="64"/>
-    <w:lsdException w:name="Medium List 1 Accent 5" w:uiPriority="65"/>
-    <w:lsdException w:name="Medium List 2 Accent 5" w:uiPriority="66"/>
-    <w:lsdException w:name="Medium Grid 1 Accent 5" w:uiPriority="67"/>
-    <w:lsdException w:name="Medium Grid 2 Accent 5" w:uiPriority="68"/>
-    <w:lsdException w:name="Medium Grid 3 Accent 5" w:uiPriority="69"/>
-    <w:lsdException w:name="Dark List Accent 5" w:uiPriority="70"/>
-    <w:lsdException w:name="Colorful Shading Accent 5" w:uiPriority="71"/>
-    <w:lsdException w:name="Colorful List Accent 5" w:uiPriority="72"/>
-    <w:lsdException w:name="Colorful Grid Accent 5" w:uiPriority="73"/>
-    <w:lsdException w:name="Light Shading Accent 6" w:uiPriority="60"/>
-    <w:lsdException w:name="Light List Accent 6" w:uiPriority="61"/>
-    <w:lsdException w:name="Light Grid Accent 6" w:uiPriority="62"/>
-    <w:lsdException w:name="Medium Shading 1 Accent 6" w:uiPriority="63"/>
-    <w:lsdException w:name="Medium Shading 2 Accent 6" w:uiPriority="64"/>
-    <w:lsdException w:name="Medium List 1 Accent 6" w:uiPriority="65"/>
-    <w:lsdException w:name="Medium List 2 Accent 6" w:uiPriority="66"/>
-    <w:lsdException w:name="Medium Grid 1 Accent 6" w:uiPriority="67"/>
-    <w:lsdException w:name="Medium Grid 2 Accent 6" w:uiPriority="68"/>
-    <w:lsdException w:name="Medium Grid 3 Accent 6" w:uiPriority="69"/>
-    <w:lsdException w:name="Dark List Accent 6" w:uiPriority="70"/>
-    <w:lsdException w:name="Colorful Shading Accent 6" w:uiPriority="71"/>
-    <w:lsdException w:name="Colorful List Accent 6" w:uiPriority="72"/>
-    <w:lsdException w:name="Colorful Grid Accent 6" w:uiPriority="73"/>
-    <w:lsdException w:name="Subtle Emphasis" w:uiPriority="19" w:qFormat="1"/>
-    <w:lsdException w:name="Intense Emphasis" w:uiPriority="21" w:qFormat="1"/>
-    <w:lsdException w:name="Subtle Reference" w:uiPriority="31" w:qFormat="1"/>
-    <w:lsdException w:name="Intense Reference" w:uiPriority="32" w:qFormat="1"/>
-    <w:lsdException w:name="Book Title" w:uiPriority="33" w:qFormat="1"/>
-    <w:lsdException w:name="Bibliography" w:semiHidden="1" w:uiPriority="37" w:unhideWhenUsed="1"/>
-    <w:lsdException w:name="TOC Heading" w:semiHidden="1" w:uiPriority="39" w:unhideWhenUsed="1" w:qFormat="1"/>
-    <w:lsdException w:name="Plain Table 1" w:uiPriority="41"/>
-    <w:lsdException w:name="Plain Table 2" w:uiPriority="42"/>
-    <w:lsdException w:name="Plain Table 3" w:uiPriority="43"/>
-    <w:lsdException w:name="Plain Table 4" w:uiPriority="44"/>
-    <w:lsdException w:name="Plain Table 5" w:uiPriority="45"/>
-    <w:lsdException w:name="Grid Table Light" w:uiPriority="40"/>
-    <w:lsdException w:name="Grid Table 1 Light" w:uiPriority="46"/>
-    <w:lsdException w:name="Grid Table 2" w:uiPriority="47"/>
-    <w:lsdException w:name="Grid Table 3" w:uiPriority="48"/>
-    <w:lsdException w:name="Grid Table 4" w:uiPriority="49"/>
-    <w:lsdException w:name="Grid Table 5 Dark" w:uiPriority="50"/>
-    <w:lsdException w:name="Grid Table 6 Colorful" w:uiPriority="51"/>
-    <w:lsdException w:name="Grid Table 7 Colorful" w:uiPriority="52"/>
-    <w:lsdException w:name="Grid Table 1 Light Accent 1" w:uiPriority="46"/>
-    <w:lsdException w:name="Grid Table 2 Accent 1" w:uiPriority="47"/>
-    <w:lsdException w:name="Grid Table 3 Accent 1" w:uiPriority="48"/>
-    <w:lsdException w:name="Grid Table 4 Accent 1" w:uiPriority="49"/>
-    <w:lsdException w:name="Grid Table 5 Dark Accent 1" w:uiPriority="50"/>
-    <w:lsdException w:name="Grid Table 6 Colorful Accent 1" w:uiPriority="51"/>
-    <w:lsdException w:name="Grid Table 7 Colorful Accent 1" w:uiPriority="52"/>
-    <w:lsdException w:name="Grid Table 1 Light Accent 2" w:uiPriority="46"/>
-    <w:lsdException w:name="Grid Table 2 Accent 2" w:uiPriority="47"/>
-    <w:lsdException w:name="Grid Table 3 Accent 2" w:uiPriority="48"/>
-    <w:lsdException w:name="Grid Table 4 Accent 2" w:uiPriority="49"/>
-    <w:lsdException w:name="Grid Table 5 Dark Accent 2" w:uiPriority="50"/>
-    <w:lsdException w:name="Grid Table 6 Colorful Accent 2" w:uiPriority="51"/>
-    <w:lsdException w:name="Grid Table 7 Colorful Accent 2" w:uiPriority="52"/>
-    <w:lsdException w:name="Grid Table 1 Light Accent 3" w:uiPriority="46"/>
-    <w:lsdException w:name="Grid Table 2 Accent 3" w:uiPriority="47"/>
-    <w:lsdException w:name="Grid Table 3 Accent 3" w:uiPriority="48"/>
-    <w:lsdException w:name="Grid Table 4 Accent 3" w:uiPriority="49"/>
-    <w:lsdException w:name="Grid Table 5 Dark Accent 3" w:uiPriority="50"/>
-    <w:lsdException w:name="Grid Table 6 Colorful Accent 3" w:uiPriority="51"/>
-    <w:lsdException w:name="Grid Table 7 Colorful Accent 3" w:uiPriority="52"/>
-    <w:lsdException w:name="Grid Table 1 Light Accent 4" w:uiPriority="46"/>
-    <w:lsdException w:name="Grid Table 2 Accent 4" w:uiPriority="47"/>
-    <w:lsdException w:name="Grid Table 3 Accent 4" w:uiPriority="48"/>
-    <w:lsdException w:name="Grid Table 4 Accent 4" w:uiPriority="49"/>
-    <w:lsdException w:name="Grid Table 5 Dark Accent 4" w:uiPriority="50"/>
-    <w:lsdException w:name="Grid Table 6 Colorful Accent 4" w:uiPriority="51"/>
-    <w:lsdException w:name="Grid Table 7 Colorful Accent 4" w:uiPriority="52"/>
-    <w:lsdException w:name="Grid Table 1 Light Accent 5" w:uiPriority="46"/>
-    <w:lsdException w:name="Grid Table 2 Accent 5" w:uiPriority="47"/>
-    <w:lsdException w:name="Grid Table 3 Accent 5" w:uiPriority="48"/>
-    <w:lsdException w:name="Grid Table 4 Accent 5" w:uiPriority="49"/>
-    <w:lsdException w:name="Grid Table 5 Dark Accent 5" w:uiPriority="50"/>
-    <w:lsdException w:name="Grid Table 6 Colorful Accent 5" w:uiPriority="51"/>
-    <w:lsdException w:name="Grid Table 7 Colorful Accent 5" w:uiPriority="52"/>
-    <w:lsdException w:name="Grid Table 1 Light Accent 6" w:uiPriority="46"/>
-    <w:lsdException w:name="Grid Table 2 Accent 6" w:uiPriority="47"/>
-    <w:lsdException w:name="Grid Table 3 Accent 6" w:uiPriority="48"/>
-    <w:lsdException w:name="Grid Table 4 Accent 6" w:uiPriority="49"/>
-    <w:lsdException w:name="Grid Table 5 Dark Accent 6" w:uiPriority="50"/>
-    <w:lsdException w:name="Grid Table 6 Colorful Accent 6" w:uiPriority="51"/>
-    <w:lsdException w:name="Grid Table 7 Colorful Accent 6" w:uiPriority="52"/>
-    <w:lsdException w:name="List Table 1 Light" w:uiPriority="46"/>
-    <w:lsdException w:name="List Table 2" w:uiPriority="47"/>
-    <w:lsdException w:name="List Table 3" w:uiPriority="48"/>
-    <w:lsdException w:name="List Table 4" w:uiPriority="49"/>
-    <w:lsdException w:name="List Table 5 Dark" w:uiPriority="50"/>
-    <w:lsdException w:name="List Table 6 Colorful" w:uiPriority="51"/>
-    <w:lsdException w:name="List Table 7 Colorful" w:uiPriority="52"/>
-    <w:lsdException w:name="List Table 1 Light Accent 1" w:uiPriority="46"/>
-    <w:lsdException w:name="List Table 2 Accent 1" w:uiPriority="47"/>
-    <w:lsdException w:name="List Table 3 Accent 1" w:uiPriority="48"/>
-    <w:lsdException w:name="List Table 4 Accent 1" w:uiPriority="49"/>
-    <w:lsdException w:name="List Table 5 Dark Accent 1" w:uiPriority="50"/>
-    <w:lsdException w:name="List Table 6 Colorful Accent 1" w:uiPriority="51"/>
-    <w:lsdException w:name="List Table 7 Colorful Accent 1" w:uiPriority="52"/>
-    <w:lsdException w:name="List Table 1 Light Accent 2" w:uiPriority="46"/>
-    <w:lsdException w:name="List Table 2 Accent 2" w:uiPriority="47"/>
-    <w:lsdException w:name="List Table 3 Accent 2" w:uiPriority="48"/>
-    <w:lsdException w:name="List Table 4 Accent 2" w:uiPriority="49"/>
-    <w:lsdException w:name="List Table 5 Dark Accent 2" w:uiPriority="50"/>
-    <w:lsdException w:name="List Table 6 Colorful Accent 2" w:uiPriority="51"/>
-    <w:lsdException w:name="List Table 7 Colorful Accent 2" w:uiPriority="52"/>
-    <w:lsdException w:name="List Table 1 Light Accent 3" w:uiPriority="46"/>
-    <w:lsdException w:name="List Table 2 Accent 3" w:uiPriority="47"/>
-    <w:lsdException w:name="List Table 3 Accent 3" w:uiPriority="48"/>
-    <w:lsdException w:name="List Table 4 Accent 3" w:uiPriority="49"/>
-    <w:lsdException w:name="List Table 5 Dark Accent 3" w:uiPriority="50"/>
-    <w:lsdException w:name="List Table 6 Colorful Accent 3" w:uiPriority="51"/>
-    <w:lsdException w:name="List Table 7 Colorful Accent 3" w:uiPriority="52"/>
-    <w:lsdException w:name="List Table 1 Light Accent 4" w:uiPriority="46"/>
-    <w:lsdException w:name="List Table 2 Accent 4" w:uiPriority="47"/>
-    <w:lsdException w:name="List Table 3 Accent 4" w:uiPriority="48"/>
-    <w:lsdException w:name="List Table 4 Accent 4" w:uiPriority="49"/>
-    <w:lsdException w:name="List Table 5 Dark Accent 4" w:uiPriority="50"/>
-    <w:lsdException w:name="List Table 6 Colorful Accent 4" w:uiPriority="51"/>
-    <w:lsdException w:name="List Table 7 Colorful Accent 4" w:uiPriority="52"/>
-    <w:lsdException w:name="List Table 1 Light Accent 5" w:uiPriority="46"/>
-    <w:lsdException w:name="List Table 2 Accent 5" w:uiPriority="47"/>
-    <w:lsdException w:name="List Table 3 Accent 5" w:uiPriority="48"/>
-    <w:lsdException w:name="List Table 4 Accent 5" w:uiPriority="49"/>
-    <w:lsdException w:name="List Table 5 Dark Accent 5" w:uiPriority="50"/>
-    <w:lsdException w:name="List Table 6 Colorful Accent 5" w:uiPriority="51"/>
-    <w:lsdException w:name="List Table 7 Colorful Accent 5" w:uiPriority="52"/>
-    <w:lsdException w:name="List Table 1 Light Accent 6" w:uiPriority="46"/>
-    <w:lsdException w:name="List Table 2 Accent 6" w:uiPriority="47"/>
-    <w:lsdException w:name="List Table 3 Accent 6" w:uiPriority="48"/>
-    <w:lsdException w:name="List Table 4 Accent 6" w:uiPriority="49"/>
-    <w:lsdException w:name="List Table 5 Dark Accent 6" w:uiPriority="50"/>
-    <w:lsdException w:name="List Table 6 Colorful Accent 6" w:uiPriority="51"/>
-    <w:lsdException w:name="List Table 7 Colorful Accent 6" w:uiPriority="52"/>
-    <w:lsdException w:name="Mention" w:semiHidden="1" w:unhideWhenUsed="1"/>
-    <w:lsdException w:name="Smart Hyperlink" w:semiHidden="1" w:unhideWhenUsed="1"/>
-    <w:lsdException w:name="Hashtag" w:semiHidden="1" w:unhideWhenUsed="1"/>
-    <w:lsdException w:name="Unresolved Mention" w:semiHidden="1" w:unhideWhenUsed="1"/>
-    <w:lsdException w:name="Smart Link" w:semiHidden="1" w:unhideWhenUsed="1"/>
+  <w:latentStyles w:defLockedState="0" w:defUIPriority="99" w:defSemiHidden="1" w:defUnhideWhenUsed="1" w:defQFormat="0" w:count="267">
+    <w:lsdException w:name="Normal" w:semiHidden="0" w:uiPriority="0" w:unhideWhenUsed="0" w:qFormat="1"/>
+    <w:lsdException w:name="heading 1" w:semiHidden="0" w:uiPriority="9" w:unhideWhenUsed="0" w:qFormat="1"/>
+    <w:lsdException w:name="heading 2" w:uiPriority="9" w:qFormat="1"/>
+    <w:lsdException w:name="heading 3" w:uiPriority="9" w:qFormat="1"/>
+    <w:lsdException w:name="heading 4" w:uiPriority="9" w:qFormat="1"/>
+    <w:lsdException w:name="heading 5" w:uiPriority="9" w:qFormat="1"/>
+    <w:lsdException w:name="heading 6" w:uiPriority="9" w:qFormat="1"/>
+    <w:lsdException w:name="heading 7" w:uiPriority="9" w:qFormat="1"/>
+    <w:lsdException w:name="heading 8" w:uiPriority="9" w:qFormat="1"/>
+    <w:lsdException w:name="heading 9" w:uiPriority="9" w:qFormat="1"/>
+    <w:lsdException w:name="toc 1" w:uiPriority="39"/>
+    <w:lsdException w:name="toc 2" w:uiPriority="39"/>
+    <w:lsdException w:name="toc 3" w:uiPriority="39"/>
+    <w:lsdException w:name="toc 4" w:uiPriority="39"/>
+    <w:lsdException w:name="toc 5" w:uiPriority="39"/>
+    <w:lsdException w:name="toc 6" w:uiPriority="39"/>
+    <w:lsdException w:name="toc 7" w:uiPriority="39"/>
+    <w:lsdException w:name="toc 8" w:uiPriority="39"/>
+    <w:lsdException w:name="toc 9" w:uiPriority="39"/>
+    <w:lsdException w:name="caption" w:uiPriority="35" w:qFormat="1"/>
+    <w:lsdException w:name="Title" w:semiHidden="0" w:uiPriority="10" w:unhideWhenUsed="0" w:qFormat="1"/>
+    <w:lsdException w:name="Default Paragraph Font" w:uiPriority="1"/>
+    <w:lsdException w:name="Subtitle" w:semiHidden="0" w:uiPriority="11" w:unhideWhenUsed="0" w:qFormat="1"/>
+    <w:lsdException w:name="Strong" w:semiHidden="0" w:uiPriority="22" w:unhideWhenUsed="0" w:qFormat="1"/>
+    <w:lsdException w:name="Emphasis" w:semiHidden="0" w:uiPriority="20" w:unhideWhenUsed="0" w:qFormat="1"/>
+    <w:lsdException w:name="Table Grid" w:semiHidden="0" w:uiPriority="39" w:unhideWhenUsed="0"/>
+    <w:lsdException w:name="Placeholder Text" w:unhideWhenUsed="0"/>
+    <w:lsdException w:name="No Spacing" w:semiHidden="0" w:uiPriority="1" w:unhideWhenUsed="0" w:qFormat="1"/>
+    <w:lsdException w:name="Light Shading" w:semiHidden="0" w:uiPriority="60" w:unhideWhenUsed="0"/>
+    <w:lsdException w:name="Light List" w:semiHidden="0" w:uiPriority="61" w:unhideWhenUsed="0"/>
+    <w:lsdException w:name="Light Grid" w:semiHidden="0" w:uiPriority="62" w:unhideWhenUsed="0"/>
+    <w:lsdException w:name="Medium Shading 1" w:semiHidden="0" w:uiPriority="63" w:unhideWhenUsed="0"/>
+    <w:lsdException w:name="Medium Shading 2" w:semiHidden="0" w:uiPriority="64" w:unhideWhenUsed="0"/>
+    <w:lsdException w:name="Medium List 1" w:semiHidden="0" w:uiPriority="65" w:unhideWhenUsed="0"/>
+    <w:lsdException w:name="Medium List 2" w:semiHidden="0" w:uiPriority="66" w:unhideWhenUsed="0"/>
+    <w:lsdException w:name="Medium Grid 1" w:semiHidden="0" w:uiPriority="67" w:unhideWhenUsed="0"/>
+    <w:lsdException w:name="Medium Grid 2" w:semiHidden="0" w:uiPriority="68" w:unhideWhenUsed="0"/>
+    <w:lsdException w:name="Medium Grid 3" w:semiHidden="0" w:uiPriority="69" w:unhideWhenUsed="0"/>
+    <w:lsdException w:name="Dark List" w:semiHidden="0" w:uiPriority="70" w:unhideWhenUsed="0"/>
+    <w:lsdException w:name="Colorful Shading" w:semiHidden="0" w:uiPriority="71" w:unhideWhenUsed="0"/>
+    <w:lsdException w:name="Colorful List" w:semiHidden="0" w:uiPriority="72" w:unhideWhenUsed="0"/>
+    <w:lsdException w:name="Colorful Grid" w:semiHidden="0" w:uiPriority="73" w:unhideWhenUsed="0"/>
+    <w:lsdException w:name="Light Shading Accent 1" w:semiHidden="0" w:uiPriority="60" w:unhideWhenUsed="0"/>
+    <w:lsdException w:name="Light List Accent 1" w:semiHidden="0" w:uiPriority="61" w:unhideWhenUsed="0"/>
+    <w:lsdException w:name="Light Grid Accent 1" w:semiHidden="0" w:uiPriority="62" w:unhideWhenUsed="0"/>
+    <w:lsdException w:name="Medium Shading 1 Accent 1" w:semiHidden="0" w:uiPriority="63" w:unhideWhenUsed="0"/>
+    <w:lsdException w:name="Medium Shading 2 Accent 1" w:semiHidden="0" w:uiPriority="64" w:unhideWhenUsed="0"/>
+    <w:lsdException w:name="Medium List 1 Accent 1" w:semiHidden="0" w:uiPriority="65" w:unhideWhenUsed="0"/>
+    <w:lsdException w:name="Revision" w:unhideWhenUsed="0"/>
+    <w:lsdException w:name="List Paragraph" w:semiHidden="0" w:uiPriority="34" w:unhideWhenUsed="0" w:qFormat="1"/>
+    <w:lsdException w:name="Quote" w:semiHidden="0" w:uiPriority="29" w:unhideWhenUsed="0" w:qFormat="1"/>
+    <w:lsdException w:name="Intense Quote" w:semiHidden="0" w:uiPriority="30" w:unhideWhenUsed="0" w:qFormat="1"/>
+    <w:lsdException w:name="Medium List 2 Accent 1" w:semiHidden="0" w:uiPriority="66" w:unhideWhenUsed="0"/>
+    <w:lsdException w:name="Medium Grid 1 Accent 1" w:semiHidden="0" w:uiPriority="67" w:unhideWhenUsed="0"/>
+    <w:lsdException w:name="Medium Grid 2 Accent 1" w:semiHidden="0" w:uiPriority="68" w:unhideWhenUsed="0"/>
+    <w:lsdException w:name="Medium Grid 3 Accent 1" w:semiHidden="0" w:uiPriority="69" w:unhideWhenUsed="0"/>
+    <w:lsdException w:name="Dark List Accent 1" w:semiHidden="0" w:uiPriority="70" w:unhideWhenUsed="0"/>
+    <w:lsdException w:name="Colorful Shading Accent 1" w:semiHidden="0" w:uiPriority="71" w:unhideWhenUsed="0"/>
+    <w:lsdException w:name="Colorful List Accent 1" w:semiHidden="0" w:uiPriority="72" w:unhideWhenUsed="0"/>
+    <w:lsdException w:name="Colorful Grid Accent 1" w:semiHidden="0" w:uiPriority="73" w:unhideWhenUsed="0"/>
+    <w:lsdException w:name="Light Shading Accent 2" w:semiHidden="0" w:uiPriority="60" w:unhideWhenUsed="0"/>
+    <w:lsdException w:name="Light List Accent 2" w:semiHidden="0" w:uiPriority="61" w:unhideWhenUsed="0"/>
+    <w:lsdException w:name="Light Grid Accent 2" w:semiHidden="0" w:uiPriority="62" w:unhideWhenUsed="0"/>
+    <w:lsdException w:name="Medium Shading 1 Accent 2" w:semiHidden="0" w:uiPriority="63" w:unhideWhenUsed="0"/>
+    <w:lsdException w:name="Medium Shading 2 Accent 2" w:semiHidden="0" w:uiPriority="64" w:unhideWhenUsed="0"/>
+    <w:lsdException w:name="Medium List 1 Accent 2" w:semiHidden="0" w:uiPriority="65" w:unhideWhenUsed="0"/>
+    <w:lsdException w:name="Medium List 2 Accent 2" w:semiHidden="0" w:uiPriority="66" w:unhideWhenUsed="0"/>
+    <w:lsdException w:name="Medium Grid 1 Accent 2" w:semiHidden="0" w:uiPriority="67" w:unhideWhenUsed="0"/>
+    <w:lsdException w:name="Medium Grid 2 Accent 2" w:semiHidden="0" w:uiPriority="68" w:unhideWhenUsed="0"/>
+    <w:lsdException w:name="Medium Grid 3 Accent 2" w:semiHidden="0" w:uiPriority="69" w:unhideWhenUsed="0"/>
+    <w:lsdException w:name="Dark List Accent 2" w:semiHidden="0" w:uiPriority="70" w:unhideWhenUsed="0"/>
+    <w:lsdException w:name="Colorful Shading Accent 2" w:semiHidden="0" w:uiPriority="71" w:unhideWhenUsed="0"/>
+    <w:lsdException w:name="Colorful List Accent 2" w:semiHidden="0" w:uiPriority="72" w:unhideWhenUsed="0"/>
+    <w:lsdException w:name="Colorful Grid Accent 2" w:semiHidden="0" w:uiPriority="73" w:unhideWhenUsed="0"/>
+    <w:lsdException w:name="Light Shading Accent 3" w:semiHidden="0" w:uiPriority="60" w:unhideWhenUsed="0"/>
+    <w:lsdException w:name="Light List Accent 3" w:semiHidden="0" w:uiPriority="61" w:unhideWhenUsed="0"/>
+    <w:lsdException w:name="Light Grid Accent 3" w:semiHidden="0" w:uiPriority="62" w:unhideWhenUsed="0"/>
+    <w:lsdException w:name="Medium Shading 1 Accent 3" w:semiHidden="0" w:uiPriority="63" w:unhideWhenUsed="0"/>
+    <w:lsdException w:name="Medium Shading 2 Accent 3" w:semiHidden="0" w:uiPriority="64" w:unhideWhenUsed="0"/>
+    <w:lsdException w:name="Medium List 1 Accent 3" w:semiHidden="0" w:uiPriority="65" w:unhideWhenUsed="0"/>
+    <w:lsdException w:name="Medium List 2 Accent 3" w:semiHidden="0" w:uiPriority="66" w:unhideWhenUsed="0"/>
+    <w:lsdException w:name="Medium Grid 1 Accent 3" w:semiHidden="0" w:uiPriority="67" w:unhideWhenUsed="0"/>
+    <w:lsdException w:name="Medium Grid 2 Accent 3" w:semiHidden="0" w:uiPriority="68" w:unhideWhenUsed="0"/>
+    <w:lsdException w:name="Medium Grid 3 Accent 3" w:semiHidden="0" w:uiPriority="69" w:unhideWhenUsed="0"/>
+    <w:lsdException w:name="Dark List Accent 3" w:semiHidden="0" w:uiPriority="70" w:unhideWhenUsed="0"/>
+    <w:lsdException w:name="Colorful Shading Accent 3" w:semiHidden="0" w:uiPriority="71" w:unhideWhenUsed="0"/>
+    <w:lsdException w:name="Colorful List Accent 3" w:semiHidden="0" w:uiPriority="72" w:unhideWhenUsed="0"/>
+    <w:lsdException w:name="Colorful Grid Accent 3" w:semiHidden="0" w:uiPriority="73" w:unhideWhenUsed="0"/>
+    <w:lsdException w:name="Light Shading Accent 4" w:semiHidden="0" w:uiPriority="60" w:unhideWhenUsed="0"/>
+    <w:lsdException w:name="Light List Accent 4" w:semiHidden="0" w:uiPriority="61" w:unhideWhenUsed="0"/>
+    <w:lsdException w:name="Light Grid Accent 4" w:semiHidden="0" w:uiPriority="62" w:unhideWhenUsed="0"/>
+    <w:lsdException w:name="Medium Shading 1 Accent 4" w:semiHidden="0" w:uiPriority="63" w:unhideWhenUsed="0"/>
+    <w:lsdException w:name="Medium Shading 2 Accent 4" w:semiHidden="0" w:uiPriority="64" w:unhideWhenUsed="0"/>
+    <w:lsdException w:name="Medium List 1 Accent 4" w:semiHidden="0" w:uiPriority="65" w:unhideWhenUsed="0"/>
+    <w:lsdException w:name="Medium List 2 Accent 4" w:semiHidden="0" w:uiPriority="66" w:unhideWhenUsed="0"/>
+    <w:lsdException w:name="Medium Grid 1 Accent 4" w:semiHidden="0" w:uiPriority="67" w:unhideWhenUsed="0"/>
+    <w:lsdException w:name="Medium Grid 2 Accent 4" w:semiHidden="0" w:uiPriority="68" w:unhideWhenUsed="0"/>
+    <w:lsdException w:name="Medium Grid 3 Accent 4" w:semiHidden="0" w:uiPriority="69" w:unhideWhenUsed="0"/>
+    <w:lsdException w:name="Dark List Accent 4" w:semiHidden="0" w:uiPriority="70" w:unhideWhenUsed="0"/>
+    <w:lsdException w:name="Colorful Shading Accent 4" w:semiHidden="0" w:uiPriority="71" w:unhideWhenUsed="0"/>
+    <w:lsdException w:name="Colorful List Accent 4" w:semiHidden="0" w:uiPriority="72" w:unhideWhenUsed="0"/>
+    <w:lsdException w:name="Colorful Grid Accent 4" w:semiHidden="0" w:uiPriority="73" w:unhideWhenUsed="0"/>
+    <w:lsdException w:name="Light Shading Accent 5" w:semiHidden="0" w:uiPriority="60" w:unhideWhenUsed="0"/>
+    <w:lsdException w:name="Light List Accent 5" w:semiHidden="0" w:uiPriority="61" w:unhideWhenUsed="0"/>
+    <w:lsdException w:name="Light Grid Accent 5" w:semiHidden="0" w:uiPriority="62" w:unhideWhenUsed="0"/>
+    <w:lsdException w:name="Medium Shading 1 Accent 5" w:semiHidden="0" w:uiPriority="63" w:unhideWhenUsed="0"/>
+    <w:lsdException w:name="Medium Shading 2 Accent 5" w:semiHidden="0" w:uiPriority="64" w:unhideWhenUsed="0"/>
+    <w:lsdException w:name="Medium List 1 Accent 5" w:semiHidden="0" w:uiPriority="65" w:unhideWhenUsed="0"/>
+    <w:lsdException w:name="Medium List 2 Accent 5" w:semiHidden="0" w:uiPriority="66" w:unhideWhenUsed="0"/>
+    <w:lsdException w:name="Medium Grid 1 Accent 5" w:semiHidden="0" w:uiPriority="67" w:unhideWhenUsed="0"/>
+    <w:lsdException w:name="Medium Grid 2 Accent 5" w:semiHidden="0" w:uiPriority="68" w:unhideWhenUsed="0"/>
+    <w:lsdException w:name="Medium Grid 3 Accent 5" w:semiHidden="0" w:uiPriority="69" w:unhideWhenUsed="0"/>
+    <w:lsdException w:name="Dark List Accent 5" w:semiHidden="0" w:uiPriority="70" w:unhideWhenUsed="0"/>
+    <w:lsdException w:name="Colorful Shading Accent 5" w:semiHidden="0" w:uiPriority="71" w:unhideWhenUsed="0"/>
+    <w:lsdException w:name="Colorful List Accent 5" w:semiHidden="0" w:uiPriority="72" w:unhideWhenUsed="0"/>
+    <w:lsdException w:name="Colorful Grid Accent 5" w:semiHidden="0" w:uiPriority="73" w:unhideWhenUsed="0"/>
+    <w:lsdException w:name="Light Shading Accent 6" w:semiHidden="0" w:uiPriority="60" w:unhideWhenUsed="0"/>
+    <w:lsdException w:name="Light List Accent 6" w:semiHidden="0" w:uiPriority="61" w:unhideWhenUsed="0"/>
+    <w:lsdException w:name="Light Grid Accent 6" w:semiHidden="0" w:uiPriority="62" w:unhideWhenUsed="0"/>
+    <w:lsdException w:name="Medium Shading 1 Accent 6" w:semiHidden="0" w:uiPriority="63" w:unhideWhenUsed="0"/>
+    <w:lsdException w:name="Medium Shading 2 Accent 6" w:semiHidden="0" w:uiPriority="64" w:unhideWhenUsed="0"/>
+    <w:lsdException w:name="Medium List 1 Accent 6" w:semiHidden="0" w:uiPriority="65" w:unhideWhenUsed="0"/>
+    <w:lsdException w:name="Medium List 2 Accent 6" w:semiHidden="0" w:uiPriority="66" w:unhideWhenUsed="0"/>
+    <w:lsdException w:name="Medium Grid 1 Accent 6" w:semiHidden="0" w:uiPriority="67" w:unhideWhenUsed="0"/>
+    <w:lsdException w:name="Medium Grid 2 Accent 6" w:semiHidden="0" w:uiPriority="68" w:unhideWhenUsed="0"/>
+    <w:lsdException w:name="Medium Grid 3 Accent 6" w:semiHidden="0" w:uiPriority="69" w:unhideWhenUsed="0"/>
+    <w:lsdException w:name="Dark List Accent 6" w:semiHidden="0" w:uiPriority="70" w:unhideWhenUsed="0"/>
+    <w:lsdException w:name="Colorful Shading Accent 6" w:semiHidden="0" w:uiPriority="71" w:unhideWhenUsed="0"/>
+    <w:lsdException w:name="Colorful List Accent 6" w:semiHidden="0" w:uiPriority="72" w:unhideWhenUsed="0"/>
+    <w:lsdException w:name="Colorful Grid Accent 6" w:semiHidden="0" w:uiPriority="73" w:unhideWhenUsed="0"/>
+    <w:lsdException w:name="Subtle Emphasis" w:semiHidden="0" w:uiPriority="19" w:unhideWhenUsed="0" w:qFormat="1"/>
+    <w:lsdException w:name="Intense Emphasis" w:semiHidden="0" w:uiPriority="21" w:unhideWhenUsed="0" w:qFormat="1"/>
+    <w:lsdException w:name="Subtle Reference" w:semiHidden="0" w:uiPriority="31" w:unhideWhenUsed="0" w:qFormat="1"/>
+    <w:lsdException w:name="Intense Reference" w:semiHidden="0" w:uiPriority="32" w:unhideWhenUsed="0" w:qFormat="1"/>
+    <w:lsdException w:name="Book Title" w:semiHidden="0" w:uiPriority="33" w:unhideWhenUsed="0" w:qFormat="1"/>
+    <w:lsdException w:name="Bibliography" w:uiPriority="37"/>
+    <w:lsdException w:name="TOC Heading" w:uiPriority="39" w:qFormat="1"/>
   </w:latentStyles>
   <w:style w:type="paragraph" w:default="1" w:styleId="Normal">
     <w:name w:val="Normal"/>
     <w:qFormat/>
+    <w:rsid w:val="002A2C88"/>
   </w:style>
   <w:style w:type="paragraph" w:styleId="Heading1">
     <w:name w:val="heading 1"/>
@@ -9472,6 +9212,7 @@
   <w:style w:type="character" w:default="1" w:styleId="DefaultParagraphFont">
     <w:name w:val="Default Paragraph Font"/>
     <w:uiPriority w:val="1"/>
+    <w:semiHidden/>
     <w:unhideWhenUsed/>
   </w:style>
   <w:style w:type="table" w:default="1" w:styleId="TableNormal">
@@ -9479,6 +9220,7 @@
     <w:uiPriority w:val="99"/>
     <w:semiHidden/>
     <w:unhideWhenUsed/>
+    <w:qFormat/>
     <w:tblPr>
       <w:tblInd w:w="0" w:type="dxa"/>
       <w:tblCellMar>
@@ -9831,7 +9573,7 @@
     </a:clrScheme>
     <a:fontScheme name="Office">
       <a:majorFont>
-        <a:latin typeface="Aptos Display" panose="02110004020202020204"/>
+        <a:latin typeface="Aptos Display"/>
         <a:ea typeface=""/>
         <a:cs typeface=""/>
         <a:font script="Jpan" typeface="游ゴシック Light"/>
@@ -9883,7 +9625,7 @@
         <a:font script="Tfng" typeface="Ebrima"/>
       </a:majorFont>
       <a:minorFont>
-        <a:latin typeface="Aptos" panose="02110004020202020204"/>
+        <a:latin typeface="Aptos"/>
         <a:ea typeface=""/>
         <a:cs typeface=""/>
         <a:font script="Jpan" typeface="游ゴシック"/>
@@ -10077,7 +9819,7 @@
   <a:extraClrSchemeLst/>
   <a:extLst>
     <a:ext uri="{05A4C25C-085E-4340-85A3-A5531E510DB2}">
-      <thm15:themeFamily xmlns:thm15="http://schemas.microsoft.com/office/thememl/2012/main" name="Office Theme" id="{62F939B6-93AF-4DB8-9C6B-D6C7DFDC589F}" vid="{4A3C46E8-61CC-4603-A589-7422A47A8E4A}"/>
+      <thm15:themeFamily xmlns:thm15="http://schemas.microsoft.com/office/thememl/2012/main" xmlns="" name="Office Theme" id="{62F939B6-93AF-4DB8-9C6B-D6C7DFDC589F}" vid="{4A3C46E8-61CC-4603-A589-7422A47A8E4A}"/>
     </a:ext>
   </a:extLst>
 </a:theme>

</xml_diff>